<commit_message>
fix: pulihkan integritas struktur XML template Word docx agar dapat dibuka tanpa error
</commit_message>
<xml_diff>
--- a/TEMPLATE_SPK_BAST/TEMPLATE_BAST_PML-SM (mitra).docx
+++ b/TEMPLATE_SPK_BAST/TEMPLATE_BAST_PML-SM (mitra).docx
@@ -1,6 +1,2120 @@
 
-<file path=word/document.xml><?xml version="1.0" encoding="UTF-8" standalone="yes"?>
-<w:document xmlns:wpc="http://schemas.microsoft.com/office/word/2010/wordprocessingCanvas" xmlns:cx="http://schemas.microsoft.com/office/drawing/2014/chartex" xmlns:cx1="http://schemas.microsoft.com/office/drawing/2015/9/8/chartex" xmlns:cx2="http://schemas.microsoft.com/office/drawing/2015/10/21/chartex" xmlns:cx3="http://schemas.microsoft.com/office/drawing/2016/5/9/chartex" xmlns:cx4="http://schemas.microsoft.com/office/drawing/2016/5/10/chartex" xmlns:cx5="http://schemas.microsoft.com/office/drawing/2016/5/11/chartex" xmlns:cx6="http://schemas.microsoft.com/office/drawing/2016/5/12/chartex" xmlns:cx7="http://schemas.microsoft.com/office/drawing/2016/5/13/chartex" xmlns:cx8="http://schemas.microsoft.com/office/drawing/2016/5/14/chartex" xmlns:mc="http://schemas.openxmlformats.org/markup-compatibility/2006" xmlns:aink="http://schemas.microsoft.com/office/drawing/2016/ink" xmlns:am3d="http://schemas.microsoft.com/office/drawing/2017/model3d" xmlns:o="urn:schemas-microsoft-com:office:office" xmlns:oel="http://schemas.microsoft.com/office/2019/extlst" xmlns:r="http://schemas.openxmlformats.org/officeDocument/2006/relationships" xmlns:m="http://schemas.openxmlformats.org/officeDocument/2006/math" xmlns:v="urn:schemas-microsoft-com:vml" xmlns:wp14="http://schemas.microsoft.com/office/word/2010/wordprocessingDrawing" xmlns:wp="http://schemas.openxmlformats.org/drawingml/2006/wordprocessingDrawing" xmlns:w10="urn:schemas-microsoft-com:office:word" xmlns:w="http://schemas.openxmlformats.org/wordprocessingml/2006/main" xmlns:w14="http://schemas.microsoft.com/office/word/2010/wordml" xmlns:w15="http://schemas.microsoft.com/office/word/2012/wordml" xmlns:w16cei="http://schemas.microsoft.com/office/word/2026/wordml/cei" xmlns:w16cex="http://schemas.microsoft.com/office/word/2018/wordml/cex" xmlns:w16cid="http://schemas.microsoft.com/office/word/2016/wordml/cid" xmlns:w16="http://schemas.microsoft.com/office/word/2018/wordml" xmlns:w16du="http://schemas.microsoft.com/office/word/2023/wordml/word16du" xmlns:w16sdtdh="http://schemas.microsoft.com/office/word/2020/wordml/sdtdatahash" xmlns:w16sdtfl="http://schemas.microsoft.com/office/word/2024/wordml/sdtformatlock" xmlns:w16se="http://schemas.microsoft.com/office/word/2015/wordml/symex" xmlns:wpg="http://schemas.microsoft.com/office/word/2010/wordprocessingGroup" xmlns:wpi="http://schemas.microsoft.com/office/word/2010/wordprocessingInk" xmlns:wne="http://schemas.microsoft.com/office/word/2006/wordml" xmlns:wps="http://schemas.microsoft.com/office/word/2010/wordprocessingShape" mc:Ignorable="w14 w15 w16se w16cid w16 w16cex w16sdtdh w16sdtfl w16du wp14"><w:body><w:p><w:pPr><w:spacing w:after="0" w:line="276" w:lineRule="auto"/><w:jc w:val="center"/><w:rPr><w:rFonts w:ascii="Bookman Old Style" w:hAnsi="Bookman Old Style" w:cs="Arial"/><w:b/><w:sz w:val="24"/><w:szCs w:val="24"/></w:rPr></w:pPr><w:r><w:rPr><w:rFonts w:ascii="Bookman Old Style" w:hAnsi="Bookman Old Style" w:cs="Arial"/><w:b/><w:sz w:val="24"/><w:szCs w:val="24"/><w:lang w:val="en-US"/></w:rPr><w:t xml:space="preserve">BERITA </w:t></w:r><w:r><w:rPr><w:rFonts w:ascii="Bookman Old Style" w:hAnsi="Bookman Old Style" w:cs="Arial"/><w:b/><w:sz w:val="24"/><w:szCs w:val="24"/></w:rPr><w:t>ACARA SERAH TERIMA</w:t></w:r></w:p><w:p><w:pPr><w:spacing w:after="0" w:line="276" w:lineRule="auto"/><w:jc w:val="center"/><w:rPr><w:rFonts w:ascii="Bookman Old Style" w:hAnsi="Bookman Old Style" w:cs="Times New Roman"/><w:b/><w:color w:val="000000" w:themeColor="text1"/><w:sz w:val="24"/><w:szCs w:val="24"/><w:lang w:val="en-US"/></w:rPr></w:pPr><w:r><w:rPr><w:rFonts w:ascii="Bookman Old Style" w:hAnsi="Bookman Old Style" w:cs="Arial"/><w:b/><w:noProof/><w:sz w:val="24"/><w:szCs w:val="24"/></w:rPr><w:t>HASIL <w:t>&lt;&lt;JUDUL_PEKERJAAN_DOKUMEN&gt;&gt;</w:t></w:r><w:r><w:rPr><w:rFonts w:ascii="Bookman Old Style" w:hAnsi="Bookman Old Style" w:cs="Times New Roman"/><w:b/><w:color w:val="000000" w:themeColor="text1"/><w:sz w:val="24"/><w:szCs w:val="24"/><w:lang w:val="en-US"/></w:rPr><w:t xml:space="preserve"> TAHUN 2026</w:t></w:r></w:p><w:p><w:pPr><w:pBdr><w:bottom w:val="single" w:sz="4" w:space="1" w:color="auto"/></w:pBdr><w:spacing w:after="0" w:line="276" w:lineRule="auto"/><w:jc w:val="center"/><w:rPr><w:rFonts w:ascii="Bookman Old Style" w:hAnsi="Bookman Old Style" w:cs="Arial"/><w:b/><w:sz w:val="24"/><w:szCs w:val="24"/><w:lang w:val="en-US"/></w:rPr></w:pPr><w:r><w:rPr><w:rFonts w:ascii="Bookman Old Style" w:hAnsi="Bookman Old Style" w:cs="Times New Roman"/><w:b/><w:color w:val="000000" w:themeColor="text1"/><w:sz w:val="24"/><w:szCs w:val="24"/></w:rPr><w:t xml:space="preserve">BPS KOTA </w:t></w:r><w:r><w:rPr><w:rFonts w:ascii="Bookman Old Style" w:hAnsi="Bookman Old Style" w:cs="Times New Roman"/><w:b/><w:color w:val="000000" w:themeColor="text1"/><w:sz w:val="24"/><w:szCs w:val="24"/><w:lang w:val="en-US"/></w:rPr><w:t>SUBULUSSALA</w:t></w:r><w:r><w:rPr><w:rFonts w:ascii="Bookman Old Style" w:hAnsi="Bookman Old Style" w:cs="Times New Roman"/><w:b/><w:color w:val="000000" w:themeColor="text1"/><w:sz w:val="24"/><w:szCs w:val="24"/></w:rPr><w:t>M</w:t></w:r></w:p><w:p><w:pPr><w:jc w:val="center"/><w:rPr><w:rFonts w:ascii="Bookman Old Style" w:hAnsi="Bookman Old Style" w:cs="Arial"/><w:b/><w:noProof/><w:sz w:val="24"/><w:szCs w:val="24"/><w:lang w:val="en-ID"/></w:rPr></w:pPr><w:r><w:rPr><w:rFonts w:ascii="Bookman Old Style" w:hAnsi="Bookman Old Style" w:cs="Arial"/><w:b/><w:noProof/><w:sz w:val="24"/><w:szCs w:val="24"/><w:lang w:val="en-US"/></w:rPr><w:fldChar w:fldCharType="begin"/></w:r><w:r><w:rPr><w:rFonts w:ascii="Bookman Old Style" w:hAnsi="Bookman Old Style" w:cs="Arial"/><w:b/><w:noProof/><w:sz w:val="24"/><w:szCs w:val="24"/><w:lang w:val="en-US"/></w:rPr><w:instrText xml:space="preserve"> MERGEFIELD "Nomor" </w:instrText></w:r><w:r><w:rPr><w:rFonts w:ascii="Bookman Old Style" w:hAnsi="Bookman Old Style" w:cs="Arial"/><w:b/><w:noProof/><w:sz w:val="24"/><w:szCs w:val="24"/><w:lang w:val="en-US"/></w:rPr><w:fldChar w:fldCharType="separate"/></w:r><w:r><w:rPr><w:rFonts w:ascii="Bookman Old Style" w:hAnsi="Bookman Old Style" w:cs="Arial"/><w:b/><w:noProof/><w:sz w:val="24"/><w:szCs w:val="24"/><w:lang w:val="en-ID"/></w:rPr><w:t>&lt;&lt;NO_BAST_PML_SM&gt;&gt;</w:t></w:r></w:p><w:p><w:pPr><w:spacing w:after="0" w:line="240" w:lineRule="auto"/><w:jc w:val="center"/><w:rPr><w:rFonts w:ascii="Bookman Old Style" w:hAnsi="Bookman Old Style" w:cs="Arial"/><w:sz w:val="24"/><w:szCs w:val="24"/></w:rPr></w:pPr><w:r><w:rPr><w:rFonts w:ascii="Bookman Old Style" w:hAnsi="Bookman Old Style" w:cs="Arial"/><w:b/><w:noProof/><w:sz w:val="24"/><w:szCs w:val="24"/><w:lang w:val="en-US"/></w:rPr><w:fldChar w:fldCharType="end"/></w:r></w:p><w:p><w:pPr><w:spacing w:after="240" w:line="240" w:lineRule="auto"/><w:ind w:left="357" w:hanging="73"/><w:jc w:val="both"/><w:rPr><w:rFonts w:ascii="Bookman Old Style" w:hAnsi="Bookman Old Style" w:cs="Arial"/><w:sz w:val="24"/><w:szCs w:val="24"/></w:rPr></w:pPr><w:r><w:rPr><w:rFonts w:ascii="Bookman Old Style" w:hAnsi="Bookman Old Style" w:cs="Arial"/><w:sz w:val="24"/><w:szCs w:val="24"/><w:lang w:val="en-US"/></w:rPr><w:t xml:space="preserve"> </w:t></w:r><w:r><w:rPr><w:rFonts w:ascii="Bookman Old Style" w:hAnsi="Bookman Old Style" w:cs="Arial"/><w:sz w:val="24"/><w:szCs w:val="24"/></w:rPr><w:t>Pada hari</w:t></w:r><w:r><w:rPr><w:rFonts w:ascii="Bookman Old Style" w:hAnsi="Bookman Old Style" w:cs="Arial"/><w:sz w:val="24"/><w:szCs w:val="24"/><w:lang w:val="en-US"/></w:rPr><w:t xml:space="preserve"> </w:t></w:r><w:r><w:rPr><w:rFonts w:ascii="Bookman Old Style" w:hAnsi="Bookman Old Style" w:cs="Arial"/><w:sz w:val="24"/><w:szCs w:val="24"/></w:rPr><w:t>&lt;&lt;HARI_TERBILANG&gt;&gt;</w:t></w:r><w:r><w:rPr><w:rFonts w:ascii="Bookman Old Style" w:hAnsi="Bookman Old Style" w:cs="Arial"/><w:sz w:val="24"/><w:szCs w:val="24"/><w:lang w:val="en-US"/></w:rPr><w:t>,</w:t></w:r><w:r><w:rPr><w:rFonts w:ascii="Bookman Old Style" w:hAnsi="Bookman Old Style" w:cs="Arial"/><w:sz w:val="24"/><w:szCs w:val="24"/></w:rPr><w:t xml:space="preserve"> tanggal </w:t></w:r><w:r><w:rPr><w:rFonts w:ascii="Bookman Old Style" w:hAnsi="Bookman Old Style" w:cs="Arial"/><w:noProof/><w:sz w:val="24"/><w:szCs w:val="24"/></w:rPr><w:t>&lt;&lt;TANGGAL_TERBILANG&gt;&gt;</w:t></w:r><w:r><w:rPr><w:rFonts w:ascii="Bookman Old Style" w:hAnsi="Bookman Old Style" w:cs="Arial"/><w:sz w:val="24"/><w:szCs w:val="24"/><w:lang w:val="en-US"/></w:rPr><w:t xml:space="preserve">, </w:t></w:r><w:r><w:rPr><w:rFonts w:ascii="Bookman Old Style" w:hAnsi="Bookman Old Style" w:cs="Arial"/><w:sz w:val="24"/><w:szCs w:val="24"/></w:rPr><w:t xml:space="preserve">bulan </w:t></w:r><w:r><w:rPr><w:rFonts w:ascii="Bookman Old Style" w:hAnsi="Bookman Old Style" w:cs="Arial"/><w:noProof/><w:sz w:val="24"/><w:szCs w:val="24"/></w:rPr><w:t>&lt;&lt;BULAN_TERBILANG&gt;&gt;</w:t></w:r><w:r><w:rPr><w:rFonts w:ascii="Bookman Old Style" w:hAnsi="Bookman Old Style" w:cs="Arial"/><w:sz w:val="24"/><w:szCs w:val="24"/><w:lang w:val="en-US"/></w:rPr><w:t xml:space="preserve">, </w:t></w:r><w:r><w:rPr><w:rFonts w:ascii="Bookman Old Style" w:hAnsi="Bookman Old Style" w:cs="Arial"/><w:sz w:val="24"/><w:szCs w:val="24"/></w:rPr><w:t xml:space="preserve">tahun </w:t></w:r><w:r><w:rPr><w:rFonts w:ascii="Bookman Old Style" w:hAnsi="Bookman Old Style" w:cs="Arial"/><w:sz w:val="24"/><w:szCs w:val="24"/></w:rPr><w:t>&lt;&lt;TAHUN_TERBILANG&gt;&gt;</w:t></w:r><w:r><w:rPr><w:rFonts w:ascii="Bookman Old Style" w:hAnsi="Bookman Old Style" w:cs="Arial"/><w:sz w:val="24"/><w:szCs w:val="24"/><w:lang w:val="en-US"/></w:rPr><w:t xml:space="preserve"> </w:t></w:r><w:r><w:rPr><w:rFonts w:ascii="Bookman Old Style" w:hAnsi="Bookman Old Style" w:cs="Arial"/><w:sz w:val="24"/><w:szCs w:val="24"/></w:rPr><w:t>(<w:t>&lt;&lt;TANGGAL_BAST_SM_PPK&gt;&gt;</w:t>)</w:t></w:r><w:r><w:rPr><w:rFonts w:ascii="Bookman Old Style" w:hAnsi="Bookman Old Style" w:cs="Arial"/><w:sz w:val="24"/><w:szCs w:val="24"/><w:lang w:val="en-US"/></w:rPr><w:t>,</w:t></w:r><w:r><w:rPr><w:rFonts w:ascii="Bookman Old Style" w:hAnsi="Bookman Old Style" w:cs="Arial"/><w:sz w:val="24"/><w:szCs w:val="24"/></w:rPr><w:t xml:space="preserve"> bertempat di Kota </w:t></w:r><w:proofErr w:type="spellStart"/><w:r><w:rPr><w:rFonts w:ascii="Bookman Old Style" w:hAnsi="Bookman Old Style" w:cs="Arial"/><w:sz w:val="24"/><w:szCs w:val="24"/><w:lang w:val="en-US"/></w:rPr><w:t>Subulussalam</w:t></w:r><w:proofErr w:type="spellEnd"/><w:r><w:rPr><w:rFonts w:ascii="Bookman Old Style" w:hAnsi="Bookman Old Style" w:cs="Arial"/><w:sz w:val="24"/><w:szCs w:val="24"/></w:rPr><w:t>, yang bertanda tangan di bawah ini:</w:t></w:r></w:p><w:p><w:pPr><w:pStyle w:val="ListParagraph"/><w:numPr><w:ilvl w:val="0"/><w:numId w:val="2"/></w:numPr><w:spacing w:after="0" w:line="240" w:lineRule="auto"/><w:ind w:left="709"/><w:contextualSpacing w:val="0"/><w:jc w:val="both"/><w:rPr><w:rFonts w:ascii="Bookman Old Style" w:hAnsi="Bookman Old Style" w:cs="Arial"/><w:sz w:val="24"/><w:szCs w:val="24"/><w:lang w:val="en-US"/></w:rPr></w:pPr><w:r><w:rPr><w:rFonts w:ascii="Bookman Old Style" w:hAnsi="Bookman Old Style" w:cs="Arial"/><w:sz w:val="24"/><w:szCs w:val="24"/></w:rPr><w:t xml:space="preserve">Nama </w:t></w:r><w:r><w:rPr><w:rFonts w:ascii="Bookman Old Style" w:hAnsi="Bookman Old Style" w:cs="Arial"/><w:sz w:val="24"/><w:szCs w:val="24"/></w:rPr><w:tab/></w:r><w:r><w:rPr><w:rFonts w:ascii="Bookman Old Style" w:hAnsi="Bookman Old Style" w:cs="Arial"/><w:sz w:val="24"/><w:szCs w:val="24"/></w:rPr><w:tab/></w:r><w:r><w:rPr><w:rFonts w:ascii="Bookman Old Style" w:hAnsi="Bookman Old Style" w:cs="Arial"/><w:sz w:val="24"/><w:szCs w:val="24"/></w:rPr><w:tab/></w:r><w:r><w:rPr><w:rFonts w:ascii="Bookman Old Style" w:hAnsi="Bookman Old Style" w:cs="Arial"/><w:sz w:val="24"/><w:szCs w:val="24"/></w:rPr><w:t xml:space="preserve">: </w:t></w:r><w:r><w:rPr><w:rFonts w:ascii="Bookman Old Style" w:hAnsi="Bookman Old Style" w:cs="Arial"/><w:noProof/><w:sz w:val="24"/><w:szCs w:val="24"/></w:rPr><w:t>&lt;&lt;NAMA_PIHAK_PERTAMA&gt;&gt;</w:t></w:r></w:p><w:p><w:pPr><w:pStyle w:val="ListParagraph"/><w:spacing w:after="0" w:line="240" w:lineRule="auto"/><w:ind w:left="709"/><w:contextualSpacing w:val="0"/><w:jc w:val="both"/><w:rPr><w:rFonts w:ascii="Bookman Old Style" w:hAnsi="Bookman Old Style" w:cs="Arial"/><w:sz w:val="24"/><w:szCs w:val="24"/><w:lang w:val="en-US"/></w:rPr></w:pPr><w:r><w:rPr><w:rFonts w:ascii="Bookman Old Style" w:hAnsi="Bookman Old Style" w:cs="Arial"/><w:sz w:val="24"/><w:szCs w:val="24"/><w:lang w:val="en-US"/></w:rPr><w:t>NIK</w:t></w:r><w:r><w:rPr><w:rFonts w:ascii="Bookman Old Style" w:hAnsi="Bookman Old Style" w:cs="Arial"/><w:sz w:val="24"/><w:szCs w:val="24"/><w:lang w:val="en-US"/></w:rPr><w:tab/></w:r><w:r><w:rPr><w:rFonts w:ascii="Bookman Old Style" w:hAnsi="Bookman Old Style" w:cs="Arial"/><w:sz w:val="24"/><w:szCs w:val="24"/><w:lang w:val="en-US"/></w:rPr><w:tab/></w:r><w:r><w:rPr><w:rFonts w:ascii="Bookman Old Style" w:hAnsi="Bookman Old Style" w:cs="Arial"/><w:sz w:val="24"/><w:szCs w:val="24"/><w:lang w:val="en-US"/></w:rPr><w:tab/></w:r><w:r><w:rPr><w:rFonts w:ascii="Bookman Old Style" w:hAnsi="Bookman Old Style" w:cs="Arial"/><w:sz w:val="24"/><w:szCs w:val="24"/><w:lang w:val="en-US"/></w:rPr><w:tab/></w:r><w:r><w:rPr><w:rFonts w:ascii="Bookman Old Style" w:hAnsi="Bookman Old Style" w:cs="Arial"/><w:sz w:val="24"/><w:szCs w:val="24"/><w:lang w:val="en-US"/></w:rPr><w:t xml:space="preserve">: </w:t></w:r><w:r><w:rPr><w:rFonts w:ascii="Bookman Old Style" w:hAnsi="Bookman Old Style" w:cs="Arial"/><w:noProof/><w:sz w:val="24"/><w:szCs w:val="24"/></w:rPr><w:t>&lt;&lt;NIK_PIHAK_PERTAMA&gt;&gt;</w:t></w:r></w:p><w:p><w:pPr><w:pStyle w:val="ListParagraph"/><w:spacing w:after="0" w:line="240" w:lineRule="auto"/><w:contextualSpacing w:val="0"/><w:jc w:val="both"/><w:rPr><w:rFonts w:ascii="Bookman Old Style" w:hAnsi="Bookman Old Style" w:cs="Arial"/><w:sz w:val="24"/><w:szCs w:val="24"/></w:rPr></w:pPr><w:r><w:rPr><w:rFonts w:ascii="Bookman Old Style" w:hAnsi="Bookman Old Style" w:cs="Arial"/><w:sz w:val="24"/><w:szCs w:val="24"/></w:rPr><w:t>Jabatan</w:t></w:r><w:r><w:rPr><w:rFonts w:ascii="Bookman Old Style" w:hAnsi="Bookman Old Style" w:cs="Arial"/><w:sz w:val="24"/><w:szCs w:val="24"/></w:rPr><w:tab/></w:r><w:r><w:rPr><w:rFonts w:ascii="Bookman Old Style" w:hAnsi="Bookman Old Style" w:cs="Arial"/><w:sz w:val="24"/><w:szCs w:val="24"/></w:rPr><w:tab/></w:r><w:r><w:rPr><w:rFonts w:ascii="Bookman Old Style" w:hAnsi="Bookman Old Style" w:cs="Arial"/><w:sz w:val="24"/><w:szCs w:val="24"/></w:rPr><w:tab/></w:r><w:r><w:rPr><w:rFonts w:ascii="Bookman Old Style" w:hAnsi="Bookman Old Style" w:cs="Arial"/><w:sz w:val="24"/><w:szCs w:val="24"/><w:lang w:val="en-US"/></w:rPr><w:t>:</w:t></w:r><w:r><w:rPr><w:rFonts w:ascii="Bookman Old Style" w:hAnsi="Bookman Old Style" w:cs="Arial"/><w:sz w:val="24"/><w:szCs w:val="24"/></w:rPr><w:t xml:space="preserve"> </w:t></w:r><w:r><w:rPr><w:rFonts w:ascii="Bookman Old Style" w:hAnsi="Bookman Old Style" w:cs="Arial"/><w:noProof/><w:sz w:val="24"/><w:szCs w:val="24"/></w:rPr><w:t>&lt;&lt;JABATAN_PIHAK_PERTAMA&gt;&gt;</w:t></w:r></w:p><w:p><w:pPr><w:spacing w:after="0" w:line="240" w:lineRule="auto"/><w:ind w:firstLine="720"/><w:jc w:val="both"/><w:rPr><w:rFonts w:ascii="Bookman Old Style" w:hAnsi="Bookman Old Style" w:cs="Arial"/><w:noProof/><w:sz w:val="24"/><w:szCs w:val="24"/></w:rPr></w:pPr><w:r><w:rPr><w:rFonts w:ascii="Bookman Old Style" w:hAnsi="Bookman Old Style" w:cs="Arial"/><w:sz w:val="24"/><w:szCs w:val="24"/></w:rPr><w:t xml:space="preserve">Tugas </w:t></w:r><w:r><w:rPr><w:rFonts w:ascii="Bookman Old Style" w:hAnsi="Bookman Old Style" w:cs="Arial"/><w:sz w:val="24"/><w:szCs w:val="24"/></w:rPr><w:tab/></w:r><w:r><w:rPr><w:rFonts w:ascii="Bookman Old Style" w:hAnsi="Bookman Old Style" w:cs="Arial"/><w:sz w:val="24"/><w:szCs w:val="24"/></w:rPr><w:tab/></w:r><w:r><w:rPr><w:rFonts w:ascii="Bookman Old Style" w:hAnsi="Bookman Old Style" w:cs="Arial"/><w:sz w:val="24"/><w:szCs w:val="24"/></w:rPr><w:tab/></w:r><w:r><w:rPr><w:rFonts w:ascii="Bookman Old Style" w:hAnsi="Bookman Old Style" w:cs="Arial"/><w:sz w:val="24"/><w:szCs w:val="24"/></w:rPr><w:t xml:space="preserve">: </w:t></w:r><w:r><w:rPr><w:rFonts w:ascii="Bookman Old Style" w:hAnsi="Bookman Old Style" w:cs="Arial"/><w:noProof/><w:sz w:val="24"/><w:szCs w:val="24"/></w:rPr><w:t>&lt;&lt;URAIAN_PEKERJAAN&gt;&gt;</w:t></w:r></w:p><w:p><w:pPr><w:spacing w:after="0" w:line="240" w:lineRule="auto"/><w:ind w:firstLine="720"/><w:jc w:val="both"/><w:rPr><w:rFonts w:ascii="Bookman Old Style" w:hAnsi="Bookman Old Style" w:cs="Arial"/><w:sz w:val="24"/><w:szCs w:val="24"/></w:rPr></w:pPr></w:p><w:p><w:pPr><w:pStyle w:val="ListParagraph"/><w:spacing w:after="240" w:line="240" w:lineRule="auto"/><w:ind w:left="709"/><w:contextualSpacing w:val="0"/><w:jc w:val="both"/><w:rPr><w:rFonts w:ascii="Bookman Old Style" w:hAnsi="Bookman Old Style" w:cs="Arial"/><w:sz w:val="24"/><w:szCs w:val="24"/><w:lang w:val="en-US"/></w:rPr></w:pPr><w:proofErr w:type="spellStart"/><w:r><w:rPr><w:rFonts w:ascii="Bookman Old Style" w:hAnsi="Bookman Old Style" w:cs="Arial"/><w:sz w:val="24"/><w:szCs w:val="24"/><w:lang w:val="en-US"/></w:rPr><w:t>bertindak</w:t></w:r><w:proofErr w:type="spellEnd"/><w:r><w:rPr><w:rFonts w:ascii="Bookman Old Style" w:hAnsi="Bookman Old Style" w:cs="Arial"/><w:sz w:val="24"/><w:szCs w:val="24"/><w:lang w:val="en-US"/></w:rPr><w:t xml:space="preserve"> </w:t></w:r><w:proofErr w:type="spellStart"/><w:r><w:rPr><w:rFonts w:ascii="Bookman Old Style" w:hAnsi="Bookman Old Style" w:cs="Arial"/><w:sz w:val="24"/><w:szCs w:val="24"/><w:lang w:val="en-US"/></w:rPr><w:t>untuk</w:t></w:r><w:proofErr w:type="spellEnd"/><w:r><w:rPr><w:rFonts w:ascii="Bookman Old Style" w:hAnsi="Bookman Old Style" w:cs="Arial"/><w:sz w:val="24"/><w:szCs w:val="24"/><w:lang w:val="en-US"/></w:rPr><w:t xml:space="preserve"> dan </w:t></w:r><w:proofErr w:type="spellStart"/><w:r><w:rPr><w:rFonts w:ascii="Bookman Old Style" w:hAnsi="Bookman Old Style" w:cs="Arial"/><w:sz w:val="24"/><w:szCs w:val="24"/><w:lang w:val="en-US"/></w:rPr><w:t>atas</w:t></w:r><w:proofErr w:type="spellEnd"/><w:r><w:rPr><w:rFonts w:ascii="Bookman Old Style" w:hAnsi="Bookman Old Style" w:cs="Arial"/><w:sz w:val="24"/><w:szCs w:val="24"/><w:lang w:val="en-US"/></w:rPr><w:t xml:space="preserve"> </w:t></w:r><w:proofErr w:type="spellStart"/><w:r><w:rPr><w:rFonts w:ascii="Bookman Old Style" w:hAnsi="Bookman Old Style" w:cs="Arial"/><w:sz w:val="24"/><w:szCs w:val="24"/><w:lang w:val="en-US"/></w:rPr><w:t>namanya</w:t></w:r><w:proofErr w:type="spellEnd"/><w:r><w:rPr><w:rFonts w:ascii="Bookman Old Style" w:hAnsi="Bookman Old Style" w:cs="Arial"/><w:sz w:val="24"/><w:szCs w:val="24"/><w:lang w:val="en-US"/></w:rPr><w:t xml:space="preserve"> </w:t></w:r><w:proofErr w:type="spellStart"/><w:r><w:rPr><w:rFonts w:ascii="Bookman Old Style" w:hAnsi="Bookman Old Style" w:cs="Arial"/><w:sz w:val="24"/><w:szCs w:val="24"/><w:lang w:val="en-US"/></w:rPr><w:t>sendiri</w:t></w:r><w:proofErr w:type="spellEnd"/><w:r><w:rPr><w:rFonts w:ascii="Bookman Old Style" w:hAnsi="Bookman Old Style" w:cs="Arial"/><w:sz w:val="24"/><w:szCs w:val="24"/><w:lang w:val="en-US"/></w:rPr><w:t xml:space="preserve">, </w:t></w:r><w:proofErr w:type="spellStart"/><w:r><w:rPr><w:rFonts w:ascii="Bookman Old Style" w:hAnsi="Bookman Old Style" w:cs="Arial"/><w:sz w:val="24"/><w:szCs w:val="24"/><w:lang w:val="en-US"/></w:rPr><w:t>selanjutnya</w:t></w:r><w:proofErr w:type="spellEnd"/><w:r><w:rPr><w:rFonts w:ascii="Bookman Old Style" w:hAnsi="Bookman Old Style" w:cs="Arial"/><w:sz w:val="24"/><w:szCs w:val="24"/><w:lang w:val="en-US"/></w:rPr><w:t xml:space="preserve"> </w:t></w:r><w:proofErr w:type="spellStart"/><w:r><w:rPr><w:rFonts w:ascii="Bookman Old Style" w:hAnsi="Bookman Old Style" w:cs="Arial"/><w:sz w:val="24"/><w:szCs w:val="24"/><w:lang w:val="en-US"/></w:rPr><w:t>disebut</w:t></w:r><w:proofErr w:type="spellEnd"/><w:r><w:rPr><w:rFonts w:ascii="Bookman Old Style" w:hAnsi="Bookman Old Style" w:cs="Arial"/><w:sz w:val="24"/><w:szCs w:val="24"/><w:lang w:val="en-US"/></w:rPr><w:t xml:space="preserve"> </w:t></w:r><w:proofErr w:type="spellStart"/><w:r><w:rPr><w:rFonts w:ascii="Bookman Old Style" w:hAnsi="Bookman Old Style" w:cs="Arial"/><w:sz w:val="24"/><w:szCs w:val="24"/><w:lang w:val="en-US"/></w:rPr><w:t>sebagai</w:t></w:r><w:proofErr w:type="spellEnd"/><w:r><w:rPr><w:rFonts w:ascii="Bookman Old Style" w:hAnsi="Bookman Old Style" w:cs="Arial"/><w:sz w:val="24"/><w:szCs w:val="24"/><w:lang w:val="en-US"/></w:rPr><w:t xml:space="preserve"> PIHAK PERTAMA.</w:t></w:r></w:p><w:p><w:pPr><w:pStyle w:val="ListParagraph"/><w:numPr><w:ilvl w:val="0"/><w:numId w:val="2"/></w:numPr><w:spacing w:after="0" w:line="240" w:lineRule="auto"/><w:ind w:left="709"/><w:contextualSpacing w:val="0"/><w:jc w:val="both"/><w:rPr><w:rFonts w:ascii="Bookman Old Style" w:hAnsi="Bookman Old Style" w:cs="Times New Roman"/><w:sz w:val="24"/><w:szCs w:val="24"/></w:rPr></w:pPr><w:r><w:rPr><w:rFonts w:ascii="Bookman Old Style" w:hAnsi="Bookman Old Style" w:cs="Arial"/><w:sz w:val="24"/><w:szCs w:val="24"/></w:rPr><w:t xml:space="preserve">Nama </w:t></w:r><w:r><w:rPr><w:rFonts w:ascii="Bookman Old Style" w:hAnsi="Bookman Old Style" w:cs="Arial"/><w:sz w:val="24"/><w:szCs w:val="24"/></w:rPr><w:tab/></w:r><w:r><w:rPr><w:rFonts w:ascii="Bookman Old Style" w:hAnsi="Bookman Old Style" w:cs="Arial"/><w:sz w:val="24"/><w:szCs w:val="24"/></w:rPr><w:tab/></w:r><w:r><w:rPr><w:rFonts w:ascii="Bookman Old Style" w:hAnsi="Bookman Old Style" w:cs="Arial"/><w:sz w:val="24"/><w:szCs w:val="24"/></w:rPr><w:tab/><w:t xml:space="preserve">: </w:t></w:r><w:r><w:rPr><w:rFonts w:ascii="Bookman Old Style" w:hAnsi="Bookman Old Style" w:cs="Times New Roman"/><w:sz w:val="24"/><w:szCs w:val="24"/><w:lang w:val="en-US"/></w:rPr><w:t>&lt;&lt;NAMA_KETUA_TIM&gt;&gt;</w:t></w:r></w:p><w:p><w:pPr><w:pStyle w:val="ListParagraph"/><w:spacing w:after="0" w:line="240" w:lineRule="auto"/><w:contextualSpacing w:val="0"/><w:jc w:val="both"/><w:rPr><w:rFonts w:ascii="Bookman Old Style" w:hAnsi="Bookman Old Style" w:cs="Times New Roman"/><w:sz w:val="24"/><w:szCs w:val="24"/><w:lang w:val="en-US"/></w:rPr></w:pPr><w:r><w:rPr><w:rFonts w:ascii="Bookman Old Style" w:hAnsi="Bookman Old Style" w:cs="Times New Roman"/><w:sz w:val="24"/><w:szCs w:val="24"/></w:rPr><w:t>NIP</w:t></w:r><w:r><w:rPr><w:rFonts w:ascii="Bookman Old Style" w:hAnsi="Bookman Old Style" w:cs="Times New Roman"/><w:sz w:val="24"/><w:szCs w:val="24"/></w:rPr><w:tab/></w:r><w:r><w:rPr><w:rFonts w:ascii="Bookman Old Style" w:hAnsi="Bookman Old Style" w:cs="Times New Roman"/><w:sz w:val="24"/><w:szCs w:val="24"/></w:rPr><w:tab/></w:r><w:r><w:rPr><w:rFonts w:ascii="Bookman Old Style" w:hAnsi="Bookman Old Style" w:cs="Times New Roman"/><w:sz w:val="24"/><w:szCs w:val="24"/></w:rPr><w:tab/></w:r><w:r><w:rPr><w:rFonts w:ascii="Bookman Old Style" w:hAnsi="Bookman Old Style" w:cs="Times New Roman"/><w:sz w:val="24"/><w:szCs w:val="24"/></w:rPr><w:tab/><w:t xml:space="preserve">: </w:t></w:r><w:r><w:rPr><w:rFonts w:ascii="Bookman Old Style" w:hAnsi="Bookman Old Style" w:cs="Times New Roman"/><w:sz w:val="24"/><w:szCs w:val="24"/><w:lang w:val="en-US"/></w:rPr><w:t>&lt;&lt;NIP_KETUA_TIM&gt;&gt;</w:t></w:r></w:p><w:p><w:pPr><w:pStyle w:val="ListParagraph"/><w:spacing w:after="0" w:line="240" w:lineRule="auto"/><w:contextualSpacing w:val="0"/><w:jc w:val="both"/><w:rPr><w:rFonts w:ascii="Bookman Old Style" w:hAnsi="Bookman Old Style" w:cs="Times New Roman"/><w:sz w:val="24"/><w:szCs w:val="24"/></w:rPr></w:pPr><w:r><w:rPr><w:rFonts w:ascii="Bookman Old Style" w:hAnsi="Bookman Old Style" w:cs="Times New Roman"/><w:sz w:val="24"/><w:szCs w:val="24"/></w:rPr><w:t>Golongan/Pangkat</w:t></w:r><w:r><w:rPr><w:rFonts w:ascii="Bookman Old Style" w:hAnsi="Bookman Old Style" w:cs="Times New Roman"/><w:sz w:val="24"/><w:szCs w:val="24"/></w:rPr><w:tab/><w:t xml:space="preserve">: </w:t></w:r><w:r><w:rPr><w:rFonts w:ascii="Bookman Old Style" w:hAnsi="Bookman Old Style" w:cs="Times New Roman"/><w:sz w:val="24"/><w:szCs w:val="24"/></w:rPr><w:t>&lt;&lt;GOLONGAN/PANGKAT_KETUA_TIM&gt;&gt;</w:t></w:r></w:p><w:p><w:pPr><w:pStyle w:val="ListParagraph"/><w:spacing w:after="0" w:line="240" w:lineRule="auto"/><w:contextualSpacing w:val="0"/><w:jc w:val="both"/><w:rPr><w:rFonts w:ascii="Bookman Old Style" w:hAnsi="Bookman Old Style" w:cs="Times New Roman"/><w:sz w:val="24"/><w:szCs w:val="24"/><w:lang w:val="en-US"/></w:rPr></w:pPr><w:r><w:rPr><w:rFonts w:ascii="Bookman Old Style" w:hAnsi="Bookman Old Style" w:cs="Times New Roman"/><w:sz w:val="24"/><w:szCs w:val="24"/></w:rPr><w:t xml:space="preserve">Jabatan </w:t></w:r><w:r><w:rPr><w:rFonts w:ascii="Bookman Old Style" w:hAnsi="Bookman Old Style" w:cs="Times New Roman"/><w:sz w:val="24"/><w:szCs w:val="24"/></w:rPr><w:tab/></w:r><w:r><w:rPr><w:rFonts w:ascii="Bookman Old Style" w:hAnsi="Bookman Old Style" w:cs="Times New Roman"/><w:sz w:val="24"/><w:szCs w:val="24"/></w:rPr><w:tab/></w:r><w:r><w:rPr><w:rFonts w:ascii="Bookman Old Style" w:hAnsi="Bookman Old Style" w:cs="Times New Roman"/><w:sz w:val="24"/><w:szCs w:val="24"/></w:rPr><w:tab/><w:t xml:space="preserve">: </w:t></w:r><w:r><w:rPr><w:rFonts w:ascii="Bookman Old Style" w:hAnsi="Bookman Old Style" w:cs="Times New Roman"/><w:sz w:val="24"/><w:szCs w:val="24"/><w:lang w:val="en-US"/></w:rPr><w:t>&lt;&lt;JABATAN_KETUA_TIM&gt;&gt;</w:t></w:r></w:p><w:p><w:pPr><w:pStyle w:val="ListParagraph"/><w:spacing w:after="0" w:line="240" w:lineRule="auto"/><w:contextualSpacing w:val="0"/><w:jc w:val="both"/><w:rPr><w:rFonts w:ascii="Bookman Old Style" w:hAnsi="Bookman Old Style" w:cs="Arial"/><w:sz w:val="24"/><w:szCs w:val="24"/><w:lang w:val="en-US"/></w:rPr></w:pPr><w:r><w:rPr><w:rFonts w:ascii="Bookman Old Style" w:hAnsi="Bookman Old Style" w:cs="Arial"/><w:sz w:val="24"/><w:szCs w:val="24"/><w:lang w:val="en-US"/></w:rPr><w:t xml:space="preserve">Unit </w:t></w:r><w:proofErr w:type="spellStart"/><w:r><w:rPr><w:rFonts w:ascii="Bookman Old Style" w:hAnsi="Bookman Old Style" w:cs="Arial"/><w:sz w:val="24"/><w:szCs w:val="24"/><w:lang w:val="en-US"/></w:rPr><w:t>Kerja</w:t></w:r><w:proofErr w:type="spellEnd"/><w:r><w:rPr><w:rFonts w:ascii="Bookman Old Style" w:hAnsi="Bookman Old Style" w:cs="Arial"/><w:sz w:val="24"/><w:szCs w:val="24"/><w:lang w:val="en-US"/></w:rPr><w:tab/></w:r><w:r><w:rPr><w:rFonts w:ascii="Bookman Old Style" w:hAnsi="Bookman Old Style" w:cs="Arial"/><w:sz w:val="24"/><w:szCs w:val="24"/><w:lang w:val="en-US"/></w:rPr><w:tab/></w:r><w:r><w:rPr><w:rFonts w:ascii="Bookman Old Style" w:hAnsi="Bookman Old Style" w:cs="Arial"/><w:sz w:val="24"/><w:szCs w:val="24"/><w:lang w:val="en-US"/></w:rPr><w:tab/><w:t xml:space="preserve">: BPS Kota </w:t></w:r><w:proofErr w:type="spellStart"/><w:r><w:rPr><w:rFonts w:ascii="Bookman Old Style" w:hAnsi="Bookman Old Style" w:cs="Arial"/><w:sz w:val="24"/><w:szCs w:val="24"/><w:lang w:val="en-US"/></w:rPr><w:t>Subulussalam</w:t></w:r><w:proofErr w:type="spellEnd"/></w:p><w:p><w:pPr><w:pStyle w:val="ListParagraph"/><w:spacing w:after="0" w:line="240" w:lineRule="auto"/><w:contextualSpacing w:val="0"/><w:jc w:val="both"/><w:rPr><w:rFonts w:ascii="Bookman Old Style" w:hAnsi="Bookman Old Style" w:cs="Arial"/><w:sz w:val="24"/><w:szCs w:val="24"/><w:lang w:val="en-US"/></w:rPr></w:pPr></w:p><w:p><w:pPr><w:spacing w:after="0" w:line="240" w:lineRule="auto"/><w:ind w:left="709"/><w:jc w:val="both"/><w:rPr><w:rFonts w:ascii="Bookman Old Style" w:hAnsi="Bookman Old Style" w:cs="Arial"/><w:sz w:val="24"/><w:szCs w:val="24"/><w:lang w:val="en-US"/></w:rPr></w:pPr><w:proofErr w:type="spellStart"/><w:r><w:rPr><w:rFonts w:ascii="Bookman Old Style" w:hAnsi="Bookman Old Style" w:cs="Arial"/><w:sz w:val="24"/><w:szCs w:val="24"/><w:lang w:val="en-US"/></w:rPr><w:t>bertindak</w:t></w:r><w:proofErr w:type="spellEnd"/><w:r><w:rPr><w:rFonts w:ascii="Bookman Old Style" w:hAnsi="Bookman Old Style" w:cs="Arial"/><w:sz w:val="24"/><w:szCs w:val="24"/><w:lang w:val="en-US"/></w:rPr><w:t xml:space="preserve"> </w:t></w:r><w:proofErr w:type="spellStart"/><w:r><w:rPr><w:rFonts w:ascii="Bookman Old Style" w:hAnsi="Bookman Old Style" w:cs="Arial"/><w:sz w:val="24"/><w:szCs w:val="24"/><w:lang w:val="en-US"/></w:rPr><w:t>untuk</w:t></w:r><w:proofErr w:type="spellEnd"/><w:r><w:rPr><w:rFonts w:ascii="Bookman Old Style" w:hAnsi="Bookman Old Style" w:cs="Arial"/><w:sz w:val="24"/><w:szCs w:val="24"/><w:lang w:val="en-US"/></w:rPr><w:t xml:space="preserve"> dan </w:t></w:r><w:proofErr w:type="spellStart"/><w:r><w:rPr><w:rFonts w:ascii="Bookman Old Style" w:hAnsi="Bookman Old Style" w:cs="Arial"/><w:sz w:val="24"/><w:szCs w:val="24"/><w:lang w:val="en-US"/></w:rPr><w:t>atas</w:t></w:r><w:proofErr w:type="spellEnd"/><w:r><w:rPr><w:rFonts w:ascii="Bookman Old Style" w:hAnsi="Bookman Old Style" w:cs="Arial"/><w:sz w:val="24"/><w:szCs w:val="24"/><w:lang w:val="en-US"/></w:rPr><w:t xml:space="preserve"> nama BPS Kota </w:t></w:r><w:proofErr w:type="spellStart"/><w:r><w:rPr><w:rFonts w:ascii="Bookman Old Style" w:hAnsi="Bookman Old Style" w:cs="Arial"/><w:sz w:val="24"/><w:szCs w:val="24"/><w:lang w:val="en-US"/></w:rPr><w:t>Subulussalam</w:t></w:r><w:proofErr w:type="spellEnd"/><w:r><w:rPr><w:rFonts w:ascii="Bookman Old Style" w:hAnsi="Bookman Old Style" w:cs="Arial"/><w:sz w:val="24"/><w:szCs w:val="24"/><w:lang w:val="en-US"/></w:rPr><w:t xml:space="preserve">, </w:t></w:r><w:proofErr w:type="spellStart"/><w:r><w:rPr><w:rFonts w:ascii="Bookman Old Style" w:hAnsi="Bookman Old Style" w:cs="Arial"/><w:sz w:val="24"/><w:szCs w:val="24"/><w:lang w:val="en-US"/></w:rPr><w:t>selanjutnya</w:t></w:r><w:proofErr w:type="spellEnd"/><w:r><w:rPr><w:rFonts w:ascii="Bookman Old Style" w:hAnsi="Bookman Old Style" w:cs="Arial"/><w:sz w:val="24"/><w:szCs w:val="24"/><w:lang w:val="en-US"/></w:rPr><w:t xml:space="preserve"> </w:t></w:r><w:proofErr w:type="spellStart"/><w:r><w:rPr><w:rFonts w:ascii="Bookman Old Style" w:hAnsi="Bookman Old Style" w:cs="Arial"/><w:sz w:val="24"/><w:szCs w:val="24"/><w:lang w:val="en-US"/></w:rPr><w:t>disebut</w:t></w:r><w:proofErr w:type="spellEnd"/><w:r><w:rPr><w:rFonts w:ascii="Bookman Old Style" w:hAnsi="Bookman Old Style" w:cs="Arial"/><w:sz w:val="24"/><w:szCs w:val="24"/><w:lang w:val="en-US"/></w:rPr><w:t xml:space="preserve"> </w:t></w:r><w:proofErr w:type="spellStart"/><w:r><w:rPr><w:rFonts w:ascii="Bookman Old Style" w:hAnsi="Bookman Old Style" w:cs="Arial"/><w:sz w:val="24"/><w:szCs w:val="24"/><w:lang w:val="en-US"/></w:rPr><w:t>sebagai</w:t></w:r><w:proofErr w:type="spellEnd"/><w:r><w:rPr><w:rFonts w:ascii="Bookman Old Style" w:hAnsi="Bookman Old Style" w:cs="Arial"/><w:sz w:val="24"/><w:szCs w:val="24"/><w:lang w:val="en-US"/></w:rPr><w:t xml:space="preserve"> PIHAK KEDUA.</w:t></w:r></w:p><w:p><w:pPr><w:spacing w:after="0" w:line="240" w:lineRule="auto"/><w:jc w:val="both"/><w:rPr><w:rFonts w:ascii="Bookman Old Style" w:hAnsi="Bookman Old Style" w:cs="Arial"/><w:sz w:val="24"/><w:szCs w:val="24"/></w:rPr></w:pPr></w:p><w:p><w:pPr><w:spacing w:after="120" w:line="240" w:lineRule="auto"/><w:ind w:left="360"/><w:jc w:val="both"/><w:rPr><w:rFonts w:ascii="Bookman Old Style" w:hAnsi="Bookman Old Style" w:cs="Arial"/><w:sz w:val="24"/><w:szCs w:val="24"/></w:rPr></w:pPr><w:r><w:rPr><w:rFonts w:ascii="Bookman Old Style" w:hAnsi="Bookman Old Style" w:cs="Arial"/><w:sz w:val="24"/><w:szCs w:val="24"/></w:rPr><w:t xml:space="preserve">Berdasarkan Surat Keputusan Kepala BPS Kota Subulussalam </w:t></w:r><w:proofErr w:type="spellStart"/><w:r><w:rPr><w:rFonts w:ascii="Bookman Old Style" w:hAnsi="Bookman Old Style" w:cs="Arial"/><w:sz w:val="24"/><w:szCs w:val="24"/><w:lang w:val="en-US"/></w:rPr><w:t>Nomor</w:t></w:r><w:proofErr w:type="spellEnd"/><w:r><w:rPr><w:rFonts w:ascii="Bookman Old Style" w:hAnsi="Bookman Old Style" w:cs="Arial"/><w:sz w:val="24"/><w:szCs w:val="24"/><w:lang w:val="en-US"/></w:rPr><w:t xml:space="preserve"> </w:t></w:r><w:r><w:rPr><w:rFonts w:ascii="Bookman Old Style" w:hAnsi="Bookman Old Style" w:cs="Arial"/><w:sz w:val="24"/><w:szCs w:val="24"/><w:lang w:val="en-US"/></w:rPr><w:t>&lt;&lt;NOMOR_KEPKA&gt;&gt;</w:t></w:r><w:r><w:rPr><w:rFonts w:ascii="Bookman Old Style" w:hAnsi="Bookman Old Style" w:cs="Arial"/><w:sz w:val="24"/><w:szCs w:val="24"/><w:lang w:val="en-US"/></w:rPr><w:t xml:space="preserve"> </w:t></w:r><w:r><w:rPr><w:rFonts w:ascii="Bookman Old Style" w:hAnsi="Bookman Old Style" w:cs="Arial"/><w:sz w:val="24"/><w:szCs w:val="24"/></w:rPr><w:t xml:space="preserve">tanggal </w:t></w:r><w:r><w:rPr><w:rFonts w:ascii="Bookman Old Style" w:hAnsi="Bookman Old Style" w:cs="Arial"/><w:sz w:val="24"/><w:szCs w:val="24"/><w:lang w:val="en-US"/></w:rPr><w:t>&lt;&lt;TANGGAL_KEPKA&gt;&gt;</w:t></w:r><w:r><w:rPr><w:rFonts w:ascii="Bookman Old Style" w:hAnsi="Bookman Old Style" w:cs="Arial"/><w:sz w:val="24"/><w:szCs w:val="24"/></w:rPr><w:t xml:space="preserve">, bersama ini PIHAK PERTAMA telah menyerahkan pekerjaan </w:t></w:r><w:proofErr w:type="spellStart"/><w:r><w:rPr><w:rFonts w:ascii="Bookman Old Style" w:hAnsi="Bookman Old Style" w:cs="Arial"/><w:sz w:val="24"/><w:szCs w:val="24"/><w:lang w:val="en-US"/></w:rPr><w:t>hasil</w:t></w:r><w:proofErr w:type="spellEnd"/><w:r><w:rPr><w:rFonts w:ascii="Bookman Old Style" w:hAnsi="Bookman Old Style" w:cs="Arial"/><w:sz w:val="24"/><w:szCs w:val="24"/><w:lang w:val="en-US"/></w:rPr><w:t xml:space="preserve"> </w:t></w:r><w:r><w:rPr><w:rFonts w:ascii="Bookman Old Style" w:hAnsi="Bookman Old Style" w:cs="Arial"/><w:noProof/><w:sz w:val="24"/><w:szCs w:val="24"/></w:rPr><w:t>&lt;&lt;URAIAN_PEKERJAAN&gt;&gt;</w:t></w:r><w:r><w:rPr><w:rFonts w:ascii="Bookman Old Style" w:hAnsi="Bookman Old Style" w:cs="Arial"/><w:sz w:val="24"/><w:szCs w:val="24"/></w:rPr><w:t xml:space="preserve">  </w:t></w:r><w:r><w:rPr><w:rFonts w:ascii="Bookman Old Style" w:hAnsi="Bookman Old Style" w:cs="Arial"/><w:sz w:val="24"/><w:szCs w:val="24"/></w:rPr><w:t>kepada PIHAK KEDUA, dengan ketentuan sebagai berikut:</w:t></w:r></w:p><w:p><w:pPr><w:pStyle w:val="ListParagraph"/><w:numPr><w:ilvl w:val="0"/><w:numId w:val="1"/></w:numPr><w:spacing w:after="120" w:line="240" w:lineRule="auto"/><w:jc w:val="both"/><w:rPr><w:rFonts w:ascii="Bookman Old Style" w:hAnsi="Bookman Old Style" w:cs="Arial"/><w:sz w:val="24"/><w:szCs w:val="24"/></w:rPr></w:pPr><w:r><w:rPr><w:rFonts w:ascii="Bookman Old Style" w:hAnsi="Bookman Old Style" w:cs="Arial"/><w:sz w:val="24"/><w:szCs w:val="24"/></w:rPr><w:t xml:space="preserve">PIHAK PERTAMA telah melaksanakan pekerjaan </w:t></w:r><w:r><w:rPr><w:rFonts w:ascii="Bookman Old Style" w:hAnsi="Bookman Old Style" w:cs="Arial"/><w:noProof/><w:sz w:val="24"/><w:szCs w:val="24"/></w:rPr><w:t>&lt;&lt;URAIAN_PEKERJAAN&gt;&gt;</w:t></w:r><w:r><w:rPr><w:rFonts w:ascii="Bookman Old Style" w:hAnsi="Bookman Old Style" w:cs="Arial"/><w:sz w:val="24"/><w:szCs w:val="24"/></w:rPr><w:t xml:space="preserve">  </w:t></w:r><w:r><w:rPr><w:rFonts w:ascii="Bookman Old Style" w:hAnsi="Bookman Old Style" w:cs="Arial"/><w:sz w:val="24"/><w:szCs w:val="24"/></w:rPr><w:t xml:space="preserve">berdasarkan Perjanjian Kerja </w:t></w:r><w:r><w:rPr><w:rFonts w:ascii="Bookman Old Style" w:hAnsi="Bookman Old Style" w:cs="Arial"/><w:sz w:val="24"/><w:szCs w:val="24"/></w:rPr><w:fldChar w:fldCharType="begin"/></w:r><w:r><w:rPr><w:rFonts w:ascii="Bookman Old Style" w:hAnsi="Bookman Old Style" w:cs="Arial"/><w:sz w:val="24"/><w:szCs w:val="24"/></w:rPr><w:instrText xml:space="preserve"> MERGEFIELD "no_SPK" </w:instrText></w:r><w:r><w:rPr><w:rFonts w:ascii="Bookman Old Style" w:hAnsi="Bookman Old Style" w:cs="Arial"/><w:sz w:val="24"/><w:szCs w:val="24"/></w:rPr><w:fldChar w:fldCharType="separate"/></w:r><w:r><w:rPr><w:rFonts w:ascii="Bookman Old Style" w:hAnsi="Bookman Old Style" w:cs="Arial"/><w:noProof/><w:sz w:val="24"/><w:szCs w:val="24"/></w:rPr><w:t xml:space="preserve">Nomor </w:t></w:r><w:r><w:rPr><w:rFonts w:ascii="Bookman Old Style" w:hAnsi="Bookman Old Style" w:cs="Arial"/><w:noProof/><w:sz w:val="24"/><w:szCs w:val="24"/></w:rPr><w:t>&lt;&lt;NO_SPK&gt;&gt;</w:t></w:r><w:r><w:rPr><w:rFonts w:ascii="Bookman Old Style" w:hAnsi="Bookman Old Style" w:cs="Arial"/><w:sz w:val="24"/><w:szCs w:val="24"/></w:rPr><w:fldChar w:fldCharType="end"/></w:r><w:r><w:rPr><w:rFonts w:ascii="Bookman Old Style" w:hAnsi="Bookman Old Style" w:cs="Arial"/><w:sz w:val="24"/><w:szCs w:val="24"/></w:rPr><w:t>,  tanggal</w:t></w:r><w:r><w:rPr><w:rFonts w:ascii="Bookman Old Style" w:hAnsi="Bookman Old Style" w:cs="Arial"/><w:sz w:val="24"/><w:szCs w:val="24"/><w:lang w:val="en-US"/></w:rPr><w:t xml:space="preserve"> </w:t></w:r><w:r><w:rPr><w:rFonts w:ascii="Bookman Old Style" w:hAnsi="Bookman Old Style" w:cs="Arial"/><w:noProof/><w:sz w:val="24"/><w:szCs w:val="24"/><w:lang w:val="en-US"/></w:rPr><w:t>&lt;&lt;TANGGAL&gt;&gt;</w:t></w:r><w:r><w:rPr><w:rFonts w:ascii="Bookman Old Style" w:hAnsi="Bookman Old Style" w:cs="Arial"/><w:sz w:val="24"/><w:szCs w:val="24"/></w:rPr><w:t>, bulan</w:t></w:r><w:r><w:rPr><w:rFonts w:ascii="Bookman Old Style" w:hAnsi="Bookman Old Style" w:cs="Arial"/><w:sz w:val="24"/><w:szCs w:val="24"/><w:lang w:val="en-US"/></w:rPr><w:t xml:space="preserve"> </w:t></w:r><w:r><w:rPr><w:rFonts w:ascii="Bookman Old Style" w:hAnsi="Bookman Old Style" w:cs="Arial"/><w:sz w:val="24"/><w:szCs w:val="24"/><w:lang w:val="en-US"/></w:rPr><w:t>&lt;&lt;BULAN&gt;&gt;</w:t></w:r><w:r><w:rPr><w:rFonts w:ascii="Bookman Old Style" w:hAnsi="Bookman Old Style" w:cs="Arial"/><w:sz w:val="24"/><w:szCs w:val="24"/></w:rPr><w:t xml:space="preserve">, </w:t></w:r><w:r><w:rPr><w:rFonts w:ascii="Bookman Old Style" w:hAnsi="Bookman Old Style" w:cs="Arial"/><w:sz w:val="24"/><w:szCs w:val="24"/></w:rPr><w:t>&lt;&lt;TAHUN&gt;&gt;</w:t></w:r><w:r><w:rPr><w:rFonts w:ascii="Bookman Old Style" w:hAnsi="Bookman Old Style" w:cs="Arial"/><w:sz w:val="24"/><w:szCs w:val="24"/></w:rPr><w:t>;</w:t></w:r></w:p><w:p><w:pPr><w:pStyle w:val="ListParagraph"/><w:numPr><w:ilvl w:val="0"/><w:numId w:val="1"/></w:numPr><w:spacing w:after="120" w:line="240" w:lineRule="auto"/><w:jc w:val="both"/><w:rPr><w:rFonts w:ascii="Bookman Old Style" w:hAnsi="Bookman Old Style" w:cs="Arial"/><w:sz w:val="24"/><w:szCs w:val="24"/></w:rPr></w:pPr><w:r><w:rPr><w:rFonts w:ascii="Bookman Old Style" w:hAnsi="Bookman Old Style" w:cs="Arial"/><w:sz w:val="24"/><w:szCs w:val="24"/></w:rPr><w:t xml:space="preserve">Berdasarkan angka 1 tersebut di atas, PIHAK PERTAMA menyerahkan hasil pekerjaan </w:t></w:r><w:r><w:rPr><w:rFonts w:ascii="Bookman Old Style" w:hAnsi="Bookman Old Style" w:cs="Arial"/><w:noProof/><w:sz w:val="24"/><w:szCs w:val="24"/></w:rPr><w:t>&lt;&lt;URAIAN_PEKERJAAN&gt;&gt;</w:t></w:r><w:r><w:rPr><w:rFonts w:ascii="Bookman Old Style" w:hAnsi="Bookman Old Style" w:cs="Arial"/><w:sz w:val="24"/><w:szCs w:val="24"/></w:rPr><w:t xml:space="preserve"> </w:t></w:r><w:r><w:rPr><w:rFonts w:ascii="Bookman Old Style" w:hAnsi="Bookman Old Style" w:cs="Arial"/><w:sz w:val="24"/><w:szCs w:val="24"/></w:rPr><w:t>kepada PIHAK KEDUA, dan PIHAK KEDUA menerima hasil pekerjaan tersebut yang telah sesuai dengan seharusnya;</w:t></w:r></w:p><w:p><w:pPr><w:pStyle w:val="ListParagraph"/><w:numPr><w:ilvl w:val="0"/><w:numId w:val="1"/></w:numPr><w:spacing w:after="120" w:line="240" w:lineRule="auto"/><w:jc w:val="both"/><w:rPr><w:rFonts w:ascii="Bookman Old Style" w:hAnsi="Bookman Old Style" w:cs="Arial"/><w:sz w:val="24"/><w:szCs w:val="24"/></w:rPr></w:pPr><w:r><w:rPr><w:rFonts w:ascii="Bookman Old Style" w:hAnsi="Bookman Old Style" w:cs="Arial"/><w:sz w:val="24"/><w:szCs w:val="24"/></w:rPr><w:t xml:space="preserve">Hasil pekerjaan PIHAK </w:t></w:r><w:r><w:rPr><w:rFonts w:ascii="Bookman Old Style" w:hAnsi="Bookman Old Style" w:cs="Arial"/><w:sz w:val="24"/><w:szCs w:val="24"/><w:lang w:val="en-US"/></w:rPr><w:t>PERTAMA</w:t></w:r><w:r><w:rPr><w:rFonts w:ascii="Bookman Old Style" w:hAnsi="Bookman Old Style" w:cs="Arial"/><w:sz w:val="24"/><w:szCs w:val="24"/></w:rPr><w:t xml:space="preserve"> telah sesuai dengan jumlah dan spesifikasi teknis/kualitas yang ditetapkan dalam </w:t></w:r><w:r><w:rPr><w:rFonts w:ascii="Bookman Old Style" w:hAnsi="Bookman Old Style" w:cs="Arial"/><w:sz w:val="24"/><w:szCs w:val="24"/><w:lang w:val="en-US"/></w:rPr><w:t>SK</w:t></w:r><w:r><w:rPr><w:rFonts w:ascii="Bookman Old Style" w:hAnsi="Bookman Old Style" w:cs="Arial"/><w:sz w:val="24"/><w:szCs w:val="24"/></w:rPr><w:t>.</w:t></w:r></w:p><w:p><w:pPr><w:pStyle w:val="ListParagraph"/><w:numPr><w:ilvl w:val="0"/><w:numId w:val="1"/></w:numPr><w:spacing w:after="120" w:line="240" w:lineRule="auto"/><w:contextualSpacing w:val="0"/><w:jc w:val="both"/><w:rPr><w:rFonts w:ascii="Bookman Old Style" w:hAnsi="Bookman Old Style" w:cs="Arial"/><w:sz w:val="24"/><w:szCs w:val="24"/></w:rPr></w:pPr><w:r><w:rPr><w:rFonts w:ascii="Bookman Old Style" w:hAnsi="Bookman Old Style" w:cs="Arial"/><w:sz w:val="24"/><w:szCs w:val="24"/></w:rPr><w:t>Pelaksanaan penyerahan hasil pekerjaan tersebut di atas dilaksanakan secara langsung di BPS Kota Subulussalam, Jl. Lae Oram Kompleks Perkantoran Walikota Subulussalam.</w:t></w:r></w:p><w:p><w:pPr><w:spacing w:after="0" w:line="240" w:lineRule="auto"/><w:ind w:left="284"/><w:jc w:val="both"/><w:rPr><w:rFonts w:ascii="Bookman Old Style" w:hAnsi="Bookman Old Style" w:cs="Arial"/><w:sz w:val="24"/><w:szCs w:val="24"/></w:rPr></w:pPr></w:p><w:p><w:pPr><w:spacing w:after="0" w:line="240" w:lineRule="auto"/><w:ind w:left="284"/><w:jc w:val="both"/><w:rPr><w:rFonts w:ascii="Bookman Old Style" w:hAnsi="Bookman Old Style" w:cs="Arial"/><w:sz w:val="24"/><w:szCs w:val="24"/></w:rPr></w:pPr><w:r><w:rPr><w:rFonts w:ascii="Bookman Old Style" w:hAnsi="Bookman Old Style" w:cs="Arial"/><w:sz w:val="24"/><w:szCs w:val="24"/></w:rPr><w:t>Demikian Berita Acara ini dibuat untuk dipergunakan sebagaimana mestinya.</w:t></w:r></w:p><w:p><w:pPr><w:spacing w:after="0" w:line="240" w:lineRule="auto"/><w:jc w:val="both"/><w:rPr><w:rFonts w:ascii="Bookman Old Style" w:hAnsi="Bookman Old Style" w:cs="Arial"/><w:sz w:val="24"/><w:szCs w:val="24"/></w:rPr></w:pPr></w:p><w:p><w:pPr><w:spacing w:after="0" w:line="240" w:lineRule="auto"/><w:jc w:val="both"/><w:rPr><w:rFonts w:ascii="Bookman Old Style" w:hAnsi="Bookman Old Style" w:cs="Arial"/><w:sz w:val="24"/><w:szCs w:val="24"/></w:rPr></w:pPr></w:p><w:tbl><w:tblPr><w:tblStyle w:val="TableGrid"/><w:tblW w:w="8790" w:type="dxa"/><w:jc w:val="center"/><w:tblLook w:val="04A0" w:firstRow="1" w:lastRow="0" w:firstColumn="1" w:lastColumn="0" w:noHBand="0" w:noVBand="1"/></w:tblPr><w:tblGrid><w:gridCol w:w="4536"/><w:gridCol w:w="4254"/></w:tblGrid><w:tr><w:trPr><w:trHeight w:val="1291"/><w:jc w:val="center"/></w:trPr><w:tc><w:tcPr><w:tcW w:w="4536" w:type="dxa"/><w:tcBorders><w:top w:val="nil"/><w:left w:val="nil"/><w:bottom w:val="nil"/><w:right w:val="nil"/></w:tcBorders></w:tcPr><w:p><w:pPr><w:jc w:val="center"/><w:rPr><w:rFonts w:ascii="Bookman Old Style" w:hAnsi="Bookman Old Style" w:cs="Arial"/><w:sz w:val="24"/><w:szCs w:val="24"/></w:rPr></w:pPr><w:r><w:rPr><w:rFonts w:ascii="Bookman Old Style" w:hAnsi="Bookman Old Style" w:cs="Arial"/><w:sz w:val="24"/><w:szCs w:val="24"/></w:rPr><w:t>PIHAK KEDUA,</w:t></w:r></w:p><w:p><w:pPr><w:jc w:val="center"/><w:rPr><w:rFonts w:ascii="Bookman Old Style" w:hAnsi="Bookman Old Style" w:cs="Arial"/><w:sz w:val="24"/><w:szCs w:val="24"/></w:rPr></w:pPr></w:p><w:p><w:pPr><w:jc w:val="center"/><w:rPr><w:rFonts w:ascii="Bookman Old Style" w:hAnsi="Bookman Old Style" w:cs="Arial"/><w:sz w:val="24"/><w:szCs w:val="24"/></w:rPr></w:pPr></w:p><w:p><w:pPr><w:jc w:val="center"/><w:rPr><w:rFonts w:ascii="Bookman Old Style" w:hAnsi="Bookman Old Style" w:cs="Arial"/><w:sz w:val="24"/><w:szCs w:val="24"/></w:rPr></w:pPr></w:p><w:p><w:pPr><w:jc w:val="center"/><w:rPr><w:rFonts w:ascii="Bookman Old Style" w:hAnsi="Bookman Old Style" w:cs="Arial"/><w:sz w:val="24"/><w:szCs w:val="24"/></w:rPr></w:pPr></w:p><w:p><w:pPr><w:jc w:val="center"/><w:rPr><w:rFonts w:ascii="Bookman Old Style" w:hAnsi="Bookman Old Style" w:cs="Times New Roman"/><w:color w:val="000000" w:themeColor="text1"/><w:sz w:val="24"/><w:szCs w:val="24"/><w:u w:val="single"/></w:rPr></w:pPr><w:r><w:rPr><w:rFonts w:ascii="Bookman Old Style" w:hAnsi="Bookman Old Style" w:cs="Times New Roman"/><w:color w:val="000000" w:themeColor="text1"/><w:sz w:val="24"/><w:szCs w:val="24"/><w:u w:val="single"/><w:lang w:val="en-US"/></w:rPr><w:lastRenderedPageBreak/><w:t>&lt;&lt;NAMA_KETUA_TIM&gt;&gt;</w:t></w:r></w:p><w:p><w:pPr><w:jc w:val="center"/><w:rPr><w:rFonts w:ascii="Bookman Old Style" w:hAnsi="Bookman Old Style" w:cs="Arial"/><w:sz w:val="24"/><w:szCs w:val="24"/><w:lang w:val="en-US"/></w:rPr></w:pPr><w:r><w:rPr><w:rFonts w:ascii="Bookman Old Style" w:hAnsi="Bookman Old Style" w:cs="Times New Roman"/><w:color w:val="000000" w:themeColor="text1"/><w:sz w:val="24"/><w:szCs w:val="24"/></w:rPr><w:t xml:space="preserve">NIP. </w:t></w:r><w:r><w:rPr><w:rFonts w:ascii="Bookman Old Style" w:hAnsi="Bookman Old Style" w:cs="Times New Roman"/><w:color w:val="000000" w:themeColor="text1"/><w:sz w:val="24"/><w:szCs w:val="24"/><w:lang w:val="en-US"/></w:rPr><w:t>&lt;&lt;NIP_KETUA_TIM&gt;&gt;</w:t></w:r></w:p></w:tc><w:tc><w:tcPr><w:tcW w:w="4254" w:type="dxa"/><w:tcBorders><w:top w:val="nil"/><w:left w:val="nil"/><w:bottom w:val="nil"/><w:right w:val="nil"/></w:tcBorders></w:tcPr><w:p><w:pPr><w:jc w:val="center"/><w:rPr><w:rFonts w:ascii="Bookman Old Style" w:hAnsi="Bookman Old Style" w:cs="Arial"/><w:sz w:val="24"/><w:szCs w:val="24"/></w:rPr></w:pPr><w:r><w:rPr><w:rFonts w:ascii="Bookman Old Style" w:hAnsi="Bookman Old Style" w:cs="Arial"/><w:sz w:val="24"/><w:szCs w:val="24"/></w:rPr><w:lastRenderedPageBreak/><w:t>PIHAK PERTAMA,</w:t></w:r></w:p><w:p><w:pPr><w:jc w:val="center"/><w:rPr><w:rFonts w:ascii="Bookman Old Style" w:hAnsi="Bookman Old Style" w:cs="Arial"/><w:sz w:val="24"/><w:szCs w:val="24"/></w:rPr></w:pPr></w:p><w:p><w:pPr><w:jc w:val="center"/><w:rPr><w:rFonts w:ascii="Bookman Old Style" w:hAnsi="Bookman Old Style" w:cs="Arial"/><w:sz w:val="24"/><w:szCs w:val="24"/></w:rPr></w:pPr></w:p><w:p><w:pPr><w:jc w:val="center"/><w:rPr><w:rFonts w:ascii="Bookman Old Style" w:hAnsi="Bookman Old Style" w:cs="Arial"/><w:sz w:val="24"/><w:szCs w:val="24"/></w:rPr></w:pPr></w:p><w:p><w:pPr><w:jc w:val="center"/><w:rPr><w:rFonts w:ascii="Bookman Old Style" w:hAnsi="Bookman Old Style" w:cs="Arial"/><w:sz w:val="24"/><w:szCs w:val="24"/></w:rPr></w:pPr></w:p><w:p><w:pPr><w:jc w:val="center"/><w:rPr><w:rFonts w:ascii="Bookman Old Style" w:hAnsi="Bookman Old Style" w:cs="Arial"/><w:noProof/><w:sz w:val="24"/><w:szCs w:val="24"/><w:u w:val="single"/></w:rPr></w:pPr><w:r><w:rPr><w:rFonts w:ascii="Bookman Old Style" w:hAnsi="Bookman Old Style" w:cs="Arial"/><w:noProof/><w:sz w:val="24"/><w:szCs w:val="24"/><w:u w:val="single"/></w:rPr><w:lastRenderedPageBreak/><w:t>&lt;&lt;NAMA_PIHAK_PERTAMA&gt;&gt;</w:t></w:r></w:p><w:p><w:pPr><w:jc w:val="center"/><w:rPr><w:rFonts w:ascii="Bookman Old Style" w:hAnsi="Bookman Old Style" w:cs="Arial"/><w:sz w:val="24"/><w:szCs w:val="24"/><w:lang w:val="en-US"/></w:rPr></w:pPr></w:p></w:tc></w:tr></w:tbl><w:p><w:pPr><w:rPr><w:rFonts w:ascii="Bookman Old Style" w:hAnsi="Bookman Old Style"/><w:sz w:val="24"/><w:szCs w:val="24"/></w:rPr></w:pPr></w:p><w:sectPr><w:pgSz w:w="11906" w:h="16838"/><w:pgMar w:top="851" w:right="851" w:bottom="851" w:left="851" w:header="709" w:footer="709" w:gutter="0"/><w:cols w:space="708"/><w:docGrid w:linePitch="360"/></w:sectPr></w:body></w:document>
+<file path=word/document.xml><?xml version="1.0" encoding="utf-8"?>
+<w:document xmlns:wpc="http://schemas.microsoft.com/office/word/2010/wordprocessingCanvas" xmlns:cx="http://schemas.microsoft.com/office/drawing/2014/chartex" xmlns:cx1="http://schemas.microsoft.com/office/drawing/2015/9/8/chartex" xmlns:cx2="http://schemas.microsoft.com/office/drawing/2015/10/21/chartex" xmlns:cx3="http://schemas.microsoft.com/office/drawing/2016/5/9/chartex" xmlns:cx4="http://schemas.microsoft.com/office/drawing/2016/5/10/chartex" xmlns:cx5="http://schemas.microsoft.com/office/drawing/2016/5/11/chartex" xmlns:cx6="http://schemas.microsoft.com/office/drawing/2016/5/12/chartex" xmlns:cx7="http://schemas.microsoft.com/office/drawing/2016/5/13/chartex" xmlns:cx8="http://schemas.microsoft.com/office/drawing/2016/5/14/chartex" xmlns:mc="http://schemas.openxmlformats.org/markup-compatibility/2006" xmlns:aink="http://schemas.microsoft.com/office/drawing/2016/ink" xmlns:am3d="http://schemas.microsoft.com/office/drawing/2017/model3d" xmlns:o="urn:schemas-microsoft-com:office:office" xmlns:oel="http://schemas.microsoft.com/office/2019/extlst" xmlns:r="http://schemas.openxmlformats.org/officeDocument/2006/relationships" xmlns:m="http://schemas.openxmlformats.org/officeDocument/2006/math" xmlns:v="urn:schemas-microsoft-com:vml" xmlns:wp14="http://schemas.microsoft.com/office/word/2010/wordprocessingDrawing" xmlns:wp="http://schemas.openxmlformats.org/drawingml/2006/wordprocessingDrawing" xmlns:w10="urn:schemas-microsoft-com:office:word" xmlns:w="http://schemas.openxmlformats.org/wordprocessingml/2006/main" xmlns:w14="http://schemas.microsoft.com/office/word/2010/wordml" xmlns:w15="http://schemas.microsoft.com/office/word/2012/wordml" xmlns:w16cei="http://schemas.microsoft.com/office/word/2026/wordml/cei" xmlns:w16cex="http://schemas.microsoft.com/office/word/2018/wordml/cex" xmlns:w16cid="http://schemas.microsoft.com/office/word/2016/wordml/cid" xmlns:w16="http://schemas.microsoft.com/office/word/2018/wordml" xmlns:w16du="http://schemas.microsoft.com/office/word/2023/wordml/word16du" xmlns:w16sdtdh="http://schemas.microsoft.com/office/word/2020/wordml/sdtdatahash" xmlns:w16sdtfl="http://schemas.microsoft.com/office/word/2024/wordml/sdtformatlock" xmlns:w16se="http://schemas.microsoft.com/office/word/2015/wordml/symex" xmlns:wpg="http://schemas.microsoft.com/office/word/2010/wordprocessingGroup" xmlns:wpi="http://schemas.microsoft.com/office/word/2010/wordprocessingInk" xmlns:wne="http://schemas.microsoft.com/office/word/2006/wordml" xmlns:wps="http://schemas.microsoft.com/office/word/2010/wordprocessingShape" mc:Ignorable="w14 w15 w16se w16cid w16 w16cex w16sdtdh w16sdtfl w16du wp14">
+  <w:body>
+    <w:p>
+      <w:pPr>
+        <w:spacing w:after="0" w:line="276" w:lineRule="auto"/>
+        <w:jc w:val="center"/>
+        <w:rPr>
+          <w:rFonts w:ascii="Bookman Old Style" w:hAnsi="Bookman Old Style" w:cs="Arial"/>
+          <w:b/>
+          <w:sz w:val="24"/>
+          <w:szCs w:val="24"/>
+        </w:rPr>
+      </w:pPr>
+      <w:r>
+        <w:rPr>
+          <w:rFonts w:ascii="Bookman Old Style" w:hAnsi="Bookman Old Style" w:cs="Arial"/>
+          <w:b/>
+          <w:sz w:val="24"/>
+          <w:szCs w:val="24"/>
+          <w:lang w:val="en-US"/>
+        </w:rPr>
+        <w:t xml:space="preserve">BERITA </w:t>
+      </w:r>
+      <w:r>
+        <w:rPr>
+          <w:rFonts w:ascii="Bookman Old Style" w:hAnsi="Bookman Old Style" w:cs="Arial"/>
+          <w:b/>
+          <w:sz w:val="24"/>
+          <w:szCs w:val="24"/>
+        </w:rPr>
+        <w:t>ACARA SERAH TERIMA</w:t>
+      </w:r>
+    </w:p>
+    <w:p>
+      <w:pPr>
+        <w:spacing w:after="0" w:line="276" w:lineRule="auto"/>
+        <w:jc w:val="center"/>
+        <w:rPr>
+          <w:rFonts w:ascii="Bookman Old Style" w:hAnsi="Bookman Old Style" w:cs="Times New Roman"/>
+          <w:b/>
+          <w:color w:val="000000" w:themeColor="text1"/>
+          <w:sz w:val="24"/>
+          <w:szCs w:val="24"/>
+          <w:lang w:val="en-US"/>
+        </w:rPr>
+      </w:pPr>
+      <w:r>
+        <w:rPr>
+          <w:rFonts w:ascii="Bookman Old Style" w:hAnsi="Bookman Old Style" w:cs="Arial"/>
+          <w:b/>
+          <w:noProof/>
+          <w:sz w:val="24"/>
+          <w:szCs w:val="24"/>
+        </w:rPr>
+        <w:t>HASIL &lt;&lt;JUDUL_PEKERJAAN_DOKUMEN&gt;&gt;</w:t>
+      </w:r>
+      <w:r>
+        <w:rPr>
+          <w:rFonts w:ascii="Bookman Old Style" w:hAnsi="Bookman Old Style" w:cs="Times New Roman"/>
+          <w:b/>
+          <w:color w:val="000000" w:themeColor="text1"/>
+          <w:sz w:val="24"/>
+          <w:szCs w:val="24"/>
+          <w:lang w:val="en-US"/>
+        </w:rPr>
+        <w:t xml:space="preserve"> TAHUN 2026</w:t>
+      </w:r>
+    </w:p>
+    <w:p>
+      <w:pPr>
+        <w:pBdr>
+          <w:bottom w:val="single" w:sz="4" w:space="1" w:color="auto"/>
+        </w:pBdr>
+        <w:spacing w:after="0" w:line="276" w:lineRule="auto"/>
+        <w:jc w:val="center"/>
+        <w:rPr>
+          <w:rFonts w:ascii="Bookman Old Style" w:hAnsi="Bookman Old Style" w:cs="Arial"/>
+          <w:b/>
+          <w:sz w:val="24"/>
+          <w:szCs w:val="24"/>
+          <w:lang w:val="en-US"/>
+        </w:rPr>
+      </w:pPr>
+      <w:r>
+        <w:rPr>
+          <w:rFonts w:ascii="Bookman Old Style" w:hAnsi="Bookman Old Style" w:cs="Times New Roman"/>
+          <w:b/>
+          <w:color w:val="000000" w:themeColor="text1"/>
+          <w:sz w:val="24"/>
+          <w:szCs w:val="24"/>
+        </w:rPr>
+        <w:t xml:space="preserve">BPS KOTA </w:t>
+      </w:r>
+      <w:r>
+        <w:rPr>
+          <w:rFonts w:ascii="Bookman Old Style" w:hAnsi="Bookman Old Style" w:cs="Times New Roman"/>
+          <w:b/>
+          <w:color w:val="000000" w:themeColor="text1"/>
+          <w:sz w:val="24"/>
+          <w:szCs w:val="24"/>
+          <w:lang w:val="en-US"/>
+        </w:rPr>
+        <w:t>SUBULUSSALA</w:t>
+      </w:r>
+      <w:r>
+        <w:rPr>
+          <w:rFonts w:ascii="Bookman Old Style" w:hAnsi="Bookman Old Style" w:cs="Times New Roman"/>
+          <w:b/>
+          <w:color w:val="000000" w:themeColor="text1"/>
+          <w:sz w:val="24"/>
+          <w:szCs w:val="24"/>
+        </w:rPr>
+        <w:t>M</w:t>
+      </w:r>
+    </w:p>
+    <w:p>
+      <w:pPr>
+        <w:jc w:val="center"/>
+        <w:rPr>
+          <w:rFonts w:ascii="Bookman Old Style" w:hAnsi="Bookman Old Style" w:cs="Arial"/>
+          <w:b/>
+          <w:noProof/>
+          <w:sz w:val="24"/>
+          <w:szCs w:val="24"/>
+          <w:lang w:val="en-ID"/>
+        </w:rPr>
+      </w:pPr>
+      <w:r>
+        <w:rPr>
+          <w:rFonts w:ascii="Bookman Old Style" w:hAnsi="Bookman Old Style" w:cs="Arial"/>
+          <w:b/>
+          <w:noProof/>
+          <w:sz w:val="24"/>
+          <w:szCs w:val="24"/>
+          <w:lang w:val="en-US"/>
+        </w:rPr>
+        <w:fldChar w:fldCharType="begin"/>
+      </w:r>
+      <w:r>
+        <w:rPr>
+          <w:rFonts w:ascii="Bookman Old Style" w:hAnsi="Bookman Old Style" w:cs="Arial"/>
+          <w:b/>
+          <w:noProof/>
+          <w:sz w:val="24"/>
+          <w:szCs w:val="24"/>
+          <w:lang w:val="en-US"/>
+        </w:rPr>
+        <w:instrText xml:space="preserve"> MERGEFIELD "Nomor" </w:instrText>
+      </w:r>
+      <w:r>
+        <w:rPr>
+          <w:rFonts w:ascii="Bookman Old Style" w:hAnsi="Bookman Old Style" w:cs="Arial"/>
+          <w:b/>
+          <w:noProof/>
+          <w:sz w:val="24"/>
+          <w:szCs w:val="24"/>
+          <w:lang w:val="en-US"/>
+        </w:rPr>
+        <w:fldChar w:fldCharType="separate"/>
+      </w:r>
+      <w:r>
+        <w:rPr>
+          <w:rFonts w:ascii="Bookman Old Style" w:hAnsi="Bookman Old Style" w:cs="Arial"/>
+          <w:b/>
+          <w:noProof/>
+          <w:sz w:val="24"/>
+          <w:szCs w:val="24"/>
+          <w:lang w:val="en-ID"/>
+        </w:rPr>
+        <w:t>&lt;&lt;NO_BAST_P</w:t>
+      </w:r>
+      <w:r>
+        <w:rPr>
+          <w:rFonts w:ascii="Bookman Old Style" w:hAnsi="Bookman Old Style" w:cs="Arial"/>
+          <w:b/>
+          <w:noProof/>
+          <w:sz w:val="24"/>
+          <w:szCs w:val="24"/>
+          <w:lang w:val="en-ID"/>
+        </w:rPr>
+        <w:t>M</w:t>
+      </w:r>
+      <w:r>
+        <w:rPr>
+          <w:rFonts w:ascii="Bookman Old Style" w:hAnsi="Bookman Old Style" w:cs="Arial"/>
+          <w:b/>
+          <w:noProof/>
+          <w:sz w:val="24"/>
+          <w:szCs w:val="24"/>
+          <w:lang w:val="en-ID"/>
+        </w:rPr>
+        <w:t>L_SM&gt;&gt;</w:t>
+      </w:r>
+    </w:p>
+    <w:p>
+      <w:pPr>
+        <w:spacing w:after="0" w:line="240" w:lineRule="auto"/>
+        <w:jc w:val="center"/>
+        <w:rPr>
+          <w:rFonts w:ascii="Bookman Old Style" w:hAnsi="Bookman Old Style" w:cs="Arial"/>
+          <w:sz w:val="24"/>
+          <w:szCs w:val="24"/>
+        </w:rPr>
+      </w:pPr>
+      <w:r>
+        <w:rPr>
+          <w:rFonts w:ascii="Bookman Old Style" w:hAnsi="Bookman Old Style" w:cs="Arial"/>
+          <w:b/>
+          <w:noProof/>
+          <w:sz w:val="24"/>
+          <w:szCs w:val="24"/>
+          <w:lang w:val="en-US"/>
+        </w:rPr>
+        <w:fldChar w:fldCharType="end"/>
+      </w:r>
+    </w:p>
+    <w:p>
+      <w:pPr>
+        <w:spacing w:after="240" w:line="240" w:lineRule="auto"/>
+        <w:ind w:left="357" w:hanging="73"/>
+        <w:jc w:val="both"/>
+        <w:rPr>
+          <w:rFonts w:ascii="Bookman Old Style" w:hAnsi="Bookman Old Style" w:cs="Arial"/>
+          <w:sz w:val="24"/>
+          <w:szCs w:val="24"/>
+        </w:rPr>
+      </w:pPr>
+      <w:r>
+        <w:rPr>
+          <w:rFonts w:ascii="Bookman Old Style" w:hAnsi="Bookman Old Style" w:cs="Arial"/>
+          <w:sz w:val="24"/>
+          <w:szCs w:val="24"/>
+          <w:lang w:val="en-US"/>
+        </w:rPr>
+        <w:t xml:space="preserve"> </w:t>
+      </w:r>
+      <w:r>
+        <w:rPr>
+          <w:rFonts w:ascii="Bookman Old Style" w:hAnsi="Bookman Old Style" w:cs="Arial"/>
+          <w:sz w:val="24"/>
+          <w:szCs w:val="24"/>
+        </w:rPr>
+        <w:t>Pada hari</w:t>
+      </w:r>
+      <w:r>
+        <w:rPr>
+          <w:rFonts w:ascii="Bookman Old Style" w:hAnsi="Bookman Old Style" w:cs="Arial"/>
+          <w:sz w:val="24"/>
+          <w:szCs w:val="24"/>
+          <w:lang w:val="en-US"/>
+        </w:rPr>
+        <w:t xml:space="preserve"> </w:t>
+      </w:r>
+      <w:r>
+        <w:rPr>
+          <w:rFonts w:ascii="Bookman Old Style" w:hAnsi="Bookman Old Style" w:cs="Arial"/>
+          <w:sz w:val="24"/>
+          <w:szCs w:val="24"/>
+        </w:rPr>
+        <w:t>&lt;&lt;HARI_TERBILANG&gt;&gt;</w:t>
+      </w:r>
+      <w:r>
+        <w:rPr>
+          <w:rFonts w:ascii="Bookman Old Style" w:hAnsi="Bookman Old Style" w:cs="Arial"/>
+          <w:sz w:val="24"/>
+          <w:szCs w:val="24"/>
+          <w:lang w:val="en-US"/>
+        </w:rPr>
+        <w:t>,</w:t>
+      </w:r>
+      <w:r>
+        <w:rPr>
+          <w:rFonts w:ascii="Bookman Old Style" w:hAnsi="Bookman Old Style" w:cs="Arial"/>
+          <w:sz w:val="24"/>
+          <w:szCs w:val="24"/>
+        </w:rPr>
+        <w:t xml:space="preserve"> tanggal </w:t>
+      </w:r>
+      <w:r>
+        <w:rPr>
+          <w:rFonts w:ascii="Bookman Old Style" w:hAnsi="Bookman Old Style" w:cs="Arial"/>
+          <w:noProof/>
+          <w:sz w:val="24"/>
+          <w:szCs w:val="24"/>
+        </w:rPr>
+        <w:t>&lt;&lt;TANGGAL_TERBILANG&gt;&gt;</w:t>
+      </w:r>
+      <w:r>
+        <w:rPr>
+          <w:rFonts w:ascii="Bookman Old Style" w:hAnsi="Bookman Old Style" w:cs="Arial"/>
+          <w:sz w:val="24"/>
+          <w:szCs w:val="24"/>
+          <w:lang w:val="en-US"/>
+        </w:rPr>
+        <w:t xml:space="preserve">, </w:t>
+      </w:r>
+      <w:r>
+        <w:rPr>
+          <w:rFonts w:ascii="Bookman Old Style" w:hAnsi="Bookman Old Style" w:cs="Arial"/>
+          <w:sz w:val="24"/>
+          <w:szCs w:val="24"/>
+        </w:rPr>
+        <w:t xml:space="preserve">bulan </w:t>
+      </w:r>
+      <w:r>
+        <w:rPr>
+          <w:rFonts w:ascii="Bookman Old Style" w:hAnsi="Bookman Old Style" w:cs="Arial"/>
+          <w:noProof/>
+          <w:sz w:val="24"/>
+          <w:szCs w:val="24"/>
+        </w:rPr>
+        <w:t>&lt;&lt;BULAN_TERBILANG&gt;&gt;</w:t>
+      </w:r>
+      <w:r>
+        <w:rPr>
+          <w:rFonts w:ascii="Bookman Old Style" w:hAnsi="Bookman Old Style" w:cs="Arial"/>
+          <w:sz w:val="24"/>
+          <w:szCs w:val="24"/>
+          <w:lang w:val="en-US"/>
+        </w:rPr>
+        <w:t xml:space="preserve">, </w:t>
+      </w:r>
+      <w:r>
+        <w:rPr>
+          <w:rFonts w:ascii="Bookman Old Style" w:hAnsi="Bookman Old Style" w:cs="Arial"/>
+          <w:sz w:val="24"/>
+          <w:szCs w:val="24"/>
+        </w:rPr>
+        <w:t xml:space="preserve">tahun </w:t>
+      </w:r>
+      <w:r>
+        <w:rPr>
+          <w:rFonts w:ascii="Bookman Old Style" w:hAnsi="Bookman Old Style" w:cs="Arial"/>
+          <w:sz w:val="24"/>
+          <w:szCs w:val="24"/>
+        </w:rPr>
+        <w:t>&lt;&lt;TAHUN_TERBILANG&gt;&gt;</w:t>
+      </w:r>
+      <w:r>
+        <w:rPr>
+          <w:rFonts w:ascii="Bookman Old Style" w:hAnsi="Bookman Old Style" w:cs="Arial"/>
+          <w:sz w:val="24"/>
+          <w:szCs w:val="24"/>
+          <w:lang w:val="en-US"/>
+        </w:rPr>
+        <w:t xml:space="preserve"> </w:t>
+      </w:r>
+      <w:r>
+        <w:rPr>
+          <w:rFonts w:ascii="Bookman Old Style" w:hAnsi="Bookman Old Style" w:cs="Arial"/>
+          <w:sz w:val="24"/>
+          <w:szCs w:val="24"/>
+        </w:rPr>
+        <w:t>(&lt;&lt;TANGGAL_BAST_SM_PPK&gt;&gt;)</w:t>
+      </w:r>
+      <w:r>
+        <w:rPr>
+          <w:rFonts w:ascii="Bookman Old Style" w:hAnsi="Bookman Old Style" w:cs="Arial"/>
+          <w:sz w:val="24"/>
+          <w:szCs w:val="24"/>
+          <w:lang w:val="en-US"/>
+        </w:rPr>
+        <w:t>,</w:t>
+      </w:r>
+      <w:r>
+        <w:rPr>
+          <w:rFonts w:ascii="Bookman Old Style" w:hAnsi="Bookman Old Style" w:cs="Arial"/>
+          <w:sz w:val="24"/>
+          <w:szCs w:val="24"/>
+        </w:rPr>
+        <w:t xml:space="preserve"> bertempat di Kota </w:t>
+      </w:r>
+      <w:proofErr w:type="spellStart"/>
+      <w:r>
+        <w:rPr>
+          <w:rFonts w:ascii="Bookman Old Style" w:hAnsi="Bookman Old Style" w:cs="Arial"/>
+          <w:sz w:val="24"/>
+          <w:szCs w:val="24"/>
+          <w:lang w:val="en-US"/>
+        </w:rPr>
+        <w:t>Subulussalam</w:t>
+      </w:r>
+      <w:proofErr w:type="spellEnd"/>
+      <w:r>
+        <w:rPr>
+          <w:rFonts w:ascii="Bookman Old Style" w:hAnsi="Bookman Old Style" w:cs="Arial"/>
+          <w:sz w:val="24"/>
+          <w:szCs w:val="24"/>
+        </w:rPr>
+        <w:t>, yang bertanda tangan di bawah ini:</w:t>
+      </w:r>
+    </w:p>
+    <w:p>
+      <w:pPr>
+        <w:pStyle w:val="ListParagraph"/>
+        <w:numPr>
+          <w:ilvl w:val="0"/>
+          <w:numId w:val="2"/>
+        </w:numPr>
+        <w:spacing w:after="0" w:line="240" w:lineRule="auto"/>
+        <w:ind w:left="709"/>
+        <w:contextualSpacing w:val="0"/>
+        <w:jc w:val="both"/>
+        <w:rPr>
+          <w:rFonts w:ascii="Bookman Old Style" w:hAnsi="Bookman Old Style" w:cs="Arial"/>
+          <w:sz w:val="24"/>
+          <w:szCs w:val="24"/>
+          <w:lang w:val="en-US"/>
+        </w:rPr>
+      </w:pPr>
+      <w:r>
+        <w:rPr>
+          <w:rFonts w:ascii="Bookman Old Style" w:hAnsi="Bookman Old Style" w:cs="Arial"/>
+          <w:sz w:val="24"/>
+          <w:szCs w:val="24"/>
+        </w:rPr>
+        <w:t xml:space="preserve">Nama </w:t>
+      </w:r>
+      <w:r>
+        <w:rPr>
+          <w:rFonts w:ascii="Bookman Old Style" w:hAnsi="Bookman Old Style" w:cs="Arial"/>
+          <w:sz w:val="24"/>
+          <w:szCs w:val="24"/>
+        </w:rPr>
+        <w:tab/>
+      </w:r>
+      <w:r>
+        <w:rPr>
+          <w:rFonts w:ascii="Bookman Old Style" w:hAnsi="Bookman Old Style" w:cs="Arial"/>
+          <w:sz w:val="24"/>
+          <w:szCs w:val="24"/>
+        </w:rPr>
+        <w:tab/>
+      </w:r>
+      <w:r>
+        <w:rPr>
+          <w:rFonts w:ascii="Bookman Old Style" w:hAnsi="Bookman Old Style" w:cs="Arial"/>
+          <w:sz w:val="24"/>
+          <w:szCs w:val="24"/>
+        </w:rPr>
+        <w:tab/>
+      </w:r>
+      <w:r>
+        <w:rPr>
+          <w:rFonts w:ascii="Bookman Old Style" w:hAnsi="Bookman Old Style" w:cs="Arial"/>
+          <w:sz w:val="24"/>
+          <w:szCs w:val="24"/>
+        </w:rPr>
+        <w:t xml:space="preserve">: </w:t>
+      </w:r>
+      <w:r>
+        <w:rPr>
+          <w:rFonts w:ascii="Bookman Old Style" w:hAnsi="Bookman Old Style" w:cs="Arial"/>
+          <w:noProof/>
+          <w:sz w:val="24"/>
+          <w:szCs w:val="24"/>
+        </w:rPr>
+        <w:t>&lt;&lt;NAMA_PIHAK_PERTAMA&gt;&gt;</w:t>
+      </w:r>
+    </w:p>
+    <w:p>
+      <w:pPr>
+        <w:pStyle w:val="ListParagraph"/>
+        <w:spacing w:after="0" w:line="240" w:lineRule="auto"/>
+        <w:ind w:left="709"/>
+        <w:contextualSpacing w:val="0"/>
+        <w:jc w:val="both"/>
+        <w:rPr>
+          <w:rFonts w:ascii="Bookman Old Style" w:hAnsi="Bookman Old Style" w:cs="Arial"/>
+          <w:sz w:val="24"/>
+          <w:szCs w:val="24"/>
+          <w:lang w:val="en-US"/>
+        </w:rPr>
+      </w:pPr>
+      <w:r>
+        <w:rPr>
+          <w:rFonts w:ascii="Bookman Old Style" w:hAnsi="Bookman Old Style" w:cs="Arial"/>
+          <w:sz w:val="24"/>
+          <w:szCs w:val="24"/>
+          <w:lang w:val="en-US"/>
+        </w:rPr>
+        <w:t>NIK</w:t>
+      </w:r>
+      <w:r>
+        <w:rPr>
+          <w:rFonts w:ascii="Bookman Old Style" w:hAnsi="Bookman Old Style" w:cs="Arial"/>
+          <w:sz w:val="24"/>
+          <w:szCs w:val="24"/>
+          <w:lang w:val="en-US"/>
+        </w:rPr>
+        <w:tab/>
+      </w:r>
+      <w:r>
+        <w:rPr>
+          <w:rFonts w:ascii="Bookman Old Style" w:hAnsi="Bookman Old Style" w:cs="Arial"/>
+          <w:sz w:val="24"/>
+          <w:szCs w:val="24"/>
+          <w:lang w:val="en-US"/>
+        </w:rPr>
+        <w:tab/>
+      </w:r>
+      <w:r>
+        <w:rPr>
+          <w:rFonts w:ascii="Bookman Old Style" w:hAnsi="Bookman Old Style" w:cs="Arial"/>
+          <w:sz w:val="24"/>
+          <w:szCs w:val="24"/>
+          <w:lang w:val="en-US"/>
+        </w:rPr>
+        <w:tab/>
+      </w:r>
+      <w:r>
+        <w:rPr>
+          <w:rFonts w:ascii="Bookman Old Style" w:hAnsi="Bookman Old Style" w:cs="Arial"/>
+          <w:sz w:val="24"/>
+          <w:szCs w:val="24"/>
+          <w:lang w:val="en-US"/>
+        </w:rPr>
+        <w:tab/>
+      </w:r>
+      <w:r>
+        <w:rPr>
+          <w:rFonts w:ascii="Bookman Old Style" w:hAnsi="Bookman Old Style" w:cs="Arial"/>
+          <w:sz w:val="24"/>
+          <w:szCs w:val="24"/>
+          <w:lang w:val="en-US"/>
+        </w:rPr>
+        <w:t xml:space="preserve">: </w:t>
+      </w:r>
+      <w:r>
+        <w:rPr>
+          <w:rFonts w:ascii="Bookman Old Style" w:hAnsi="Bookman Old Style" w:cs="Arial"/>
+          <w:noProof/>
+          <w:sz w:val="24"/>
+          <w:szCs w:val="24"/>
+        </w:rPr>
+        <w:t>&lt;&lt;NI</w:t>
+      </w:r>
+      <w:r>
+        <w:rPr>
+          <w:rFonts w:ascii="Bookman Old Style" w:hAnsi="Bookman Old Style" w:cs="Arial"/>
+          <w:noProof/>
+          <w:sz w:val="24"/>
+          <w:szCs w:val="24"/>
+        </w:rPr>
+        <w:t>K</w:t>
+      </w:r>
+      <w:r>
+        <w:rPr>
+          <w:rFonts w:ascii="Bookman Old Style" w:hAnsi="Bookman Old Style" w:cs="Arial"/>
+          <w:noProof/>
+          <w:sz w:val="24"/>
+          <w:szCs w:val="24"/>
+        </w:rPr>
+        <w:t>_PIHAK_PERTAMA&gt;&gt;</w:t>
+      </w:r>
+    </w:p>
+    <w:p>
+      <w:pPr>
+        <w:pStyle w:val="ListParagraph"/>
+        <w:spacing w:after="0" w:line="240" w:lineRule="auto"/>
+        <w:contextualSpacing w:val="0"/>
+        <w:jc w:val="both"/>
+        <w:rPr>
+          <w:rFonts w:ascii="Bookman Old Style" w:hAnsi="Bookman Old Style" w:cs="Arial"/>
+          <w:sz w:val="24"/>
+          <w:szCs w:val="24"/>
+        </w:rPr>
+      </w:pPr>
+      <w:r>
+        <w:rPr>
+          <w:rFonts w:ascii="Bookman Old Style" w:hAnsi="Bookman Old Style" w:cs="Arial"/>
+          <w:sz w:val="24"/>
+          <w:szCs w:val="24"/>
+        </w:rPr>
+        <w:t>Jabatan</w:t>
+      </w:r>
+      <w:r>
+        <w:rPr>
+          <w:rFonts w:ascii="Bookman Old Style" w:hAnsi="Bookman Old Style" w:cs="Arial"/>
+          <w:sz w:val="24"/>
+          <w:szCs w:val="24"/>
+        </w:rPr>
+        <w:tab/>
+      </w:r>
+      <w:r>
+        <w:rPr>
+          <w:rFonts w:ascii="Bookman Old Style" w:hAnsi="Bookman Old Style" w:cs="Arial"/>
+          <w:sz w:val="24"/>
+          <w:szCs w:val="24"/>
+        </w:rPr>
+        <w:tab/>
+      </w:r>
+      <w:r>
+        <w:rPr>
+          <w:rFonts w:ascii="Bookman Old Style" w:hAnsi="Bookman Old Style" w:cs="Arial"/>
+          <w:sz w:val="24"/>
+          <w:szCs w:val="24"/>
+        </w:rPr>
+        <w:tab/>
+      </w:r>
+      <w:r>
+        <w:rPr>
+          <w:rFonts w:ascii="Bookman Old Style" w:hAnsi="Bookman Old Style" w:cs="Arial"/>
+          <w:sz w:val="24"/>
+          <w:szCs w:val="24"/>
+          <w:lang w:val="en-US"/>
+        </w:rPr>
+        <w:t>:</w:t>
+      </w:r>
+      <w:r>
+        <w:rPr>
+          <w:rFonts w:ascii="Bookman Old Style" w:hAnsi="Bookman Old Style" w:cs="Arial"/>
+          <w:sz w:val="24"/>
+          <w:szCs w:val="24"/>
+        </w:rPr>
+        <w:t xml:space="preserve"> </w:t>
+      </w:r>
+      <w:r>
+        <w:rPr>
+          <w:rFonts w:ascii="Bookman Old Style" w:hAnsi="Bookman Old Style" w:cs="Arial"/>
+          <w:noProof/>
+          <w:sz w:val="24"/>
+          <w:szCs w:val="24"/>
+        </w:rPr>
+        <w:t>&lt;&lt;JABATAN_PIHAK_PERTAMA&gt;&gt;</w:t>
+      </w:r>
+    </w:p>
+    <w:p>
+      <w:pPr>
+        <w:spacing w:after="0" w:line="240" w:lineRule="auto"/>
+        <w:ind w:firstLine="720"/>
+        <w:jc w:val="both"/>
+        <w:rPr>
+          <w:rFonts w:ascii="Bookman Old Style" w:hAnsi="Bookman Old Style" w:cs="Arial"/>
+          <w:noProof/>
+          <w:sz w:val="24"/>
+          <w:szCs w:val="24"/>
+        </w:rPr>
+      </w:pPr>
+      <w:r>
+        <w:rPr>
+          <w:rFonts w:ascii="Bookman Old Style" w:hAnsi="Bookman Old Style" w:cs="Arial"/>
+          <w:sz w:val="24"/>
+          <w:szCs w:val="24"/>
+        </w:rPr>
+        <w:t xml:space="preserve">Tugas </w:t>
+      </w:r>
+      <w:r>
+        <w:rPr>
+          <w:rFonts w:ascii="Bookman Old Style" w:hAnsi="Bookman Old Style" w:cs="Arial"/>
+          <w:sz w:val="24"/>
+          <w:szCs w:val="24"/>
+        </w:rPr>
+        <w:tab/>
+      </w:r>
+      <w:r>
+        <w:rPr>
+          <w:rFonts w:ascii="Bookman Old Style" w:hAnsi="Bookman Old Style" w:cs="Arial"/>
+          <w:sz w:val="24"/>
+          <w:szCs w:val="24"/>
+        </w:rPr>
+        <w:tab/>
+      </w:r>
+      <w:r>
+        <w:rPr>
+          <w:rFonts w:ascii="Bookman Old Style" w:hAnsi="Bookman Old Style" w:cs="Arial"/>
+          <w:sz w:val="24"/>
+          <w:szCs w:val="24"/>
+        </w:rPr>
+        <w:tab/>
+      </w:r>
+      <w:r>
+        <w:rPr>
+          <w:rFonts w:ascii="Bookman Old Style" w:hAnsi="Bookman Old Style" w:cs="Arial"/>
+          <w:sz w:val="24"/>
+          <w:szCs w:val="24"/>
+        </w:rPr>
+        <w:t xml:space="preserve">: </w:t>
+      </w:r>
+      <w:r>
+        <w:rPr>
+          <w:rFonts w:ascii="Bookman Old Style" w:hAnsi="Bookman Old Style" w:cs="Arial"/>
+          <w:noProof/>
+          <w:sz w:val="24"/>
+          <w:szCs w:val="24"/>
+        </w:rPr>
+        <w:t>&lt;&lt;URAIAN_PEKERJAAN&gt;&gt;</w:t>
+      </w:r>
+    </w:p>
+    <w:p>
+      <w:pPr>
+        <w:spacing w:after="0" w:line="240" w:lineRule="auto"/>
+        <w:ind w:firstLine="720"/>
+        <w:jc w:val="both"/>
+        <w:rPr>
+          <w:rFonts w:ascii="Bookman Old Style" w:hAnsi="Bookman Old Style" w:cs="Arial"/>
+          <w:sz w:val="24"/>
+          <w:szCs w:val="24"/>
+        </w:rPr>
+      </w:pPr>
+    </w:p>
+    <w:p>
+      <w:pPr>
+        <w:pStyle w:val="ListParagraph"/>
+        <w:spacing w:after="240" w:line="240" w:lineRule="auto"/>
+        <w:ind w:left="709"/>
+        <w:contextualSpacing w:val="0"/>
+        <w:jc w:val="both"/>
+        <w:rPr>
+          <w:rFonts w:ascii="Bookman Old Style" w:hAnsi="Bookman Old Style" w:cs="Arial"/>
+          <w:sz w:val="24"/>
+          <w:szCs w:val="24"/>
+          <w:lang w:val="en-US"/>
+        </w:rPr>
+      </w:pPr>
+      <w:proofErr w:type="spellStart"/>
+      <w:r>
+        <w:rPr>
+          <w:rFonts w:ascii="Bookman Old Style" w:hAnsi="Bookman Old Style" w:cs="Arial"/>
+          <w:sz w:val="24"/>
+          <w:szCs w:val="24"/>
+          <w:lang w:val="en-US"/>
+        </w:rPr>
+        <w:t>bertindak</w:t>
+      </w:r>
+      <w:proofErr w:type="spellEnd"/>
+      <w:r>
+        <w:rPr>
+          <w:rFonts w:ascii="Bookman Old Style" w:hAnsi="Bookman Old Style" w:cs="Arial"/>
+          <w:sz w:val="24"/>
+          <w:szCs w:val="24"/>
+          <w:lang w:val="en-US"/>
+        </w:rPr>
+        <w:t xml:space="preserve"> </w:t>
+      </w:r>
+      <w:proofErr w:type="spellStart"/>
+      <w:r>
+        <w:rPr>
+          <w:rFonts w:ascii="Bookman Old Style" w:hAnsi="Bookman Old Style" w:cs="Arial"/>
+          <w:sz w:val="24"/>
+          <w:szCs w:val="24"/>
+          <w:lang w:val="en-US"/>
+        </w:rPr>
+        <w:t>untuk</w:t>
+      </w:r>
+      <w:proofErr w:type="spellEnd"/>
+      <w:r>
+        <w:rPr>
+          <w:rFonts w:ascii="Bookman Old Style" w:hAnsi="Bookman Old Style" w:cs="Arial"/>
+          <w:sz w:val="24"/>
+          <w:szCs w:val="24"/>
+          <w:lang w:val="en-US"/>
+        </w:rPr>
+        <w:t xml:space="preserve"> dan </w:t>
+      </w:r>
+      <w:proofErr w:type="spellStart"/>
+      <w:r>
+        <w:rPr>
+          <w:rFonts w:ascii="Bookman Old Style" w:hAnsi="Bookman Old Style" w:cs="Arial"/>
+          <w:sz w:val="24"/>
+          <w:szCs w:val="24"/>
+          <w:lang w:val="en-US"/>
+        </w:rPr>
+        <w:t>atas</w:t>
+      </w:r>
+      <w:proofErr w:type="spellEnd"/>
+      <w:r>
+        <w:rPr>
+          <w:rFonts w:ascii="Bookman Old Style" w:hAnsi="Bookman Old Style" w:cs="Arial"/>
+          <w:sz w:val="24"/>
+          <w:szCs w:val="24"/>
+          <w:lang w:val="en-US"/>
+        </w:rPr>
+        <w:t xml:space="preserve"> </w:t>
+      </w:r>
+      <w:proofErr w:type="spellStart"/>
+      <w:r>
+        <w:rPr>
+          <w:rFonts w:ascii="Bookman Old Style" w:hAnsi="Bookman Old Style" w:cs="Arial"/>
+          <w:sz w:val="24"/>
+          <w:szCs w:val="24"/>
+          <w:lang w:val="en-US"/>
+        </w:rPr>
+        <w:t>namanya</w:t>
+      </w:r>
+      <w:proofErr w:type="spellEnd"/>
+      <w:r>
+        <w:rPr>
+          <w:rFonts w:ascii="Bookman Old Style" w:hAnsi="Bookman Old Style" w:cs="Arial"/>
+          <w:sz w:val="24"/>
+          <w:szCs w:val="24"/>
+          <w:lang w:val="en-US"/>
+        </w:rPr>
+        <w:t xml:space="preserve"> </w:t>
+      </w:r>
+      <w:proofErr w:type="spellStart"/>
+      <w:r>
+        <w:rPr>
+          <w:rFonts w:ascii="Bookman Old Style" w:hAnsi="Bookman Old Style" w:cs="Arial"/>
+          <w:sz w:val="24"/>
+          <w:szCs w:val="24"/>
+          <w:lang w:val="en-US"/>
+        </w:rPr>
+        <w:t>sendiri</w:t>
+      </w:r>
+      <w:proofErr w:type="spellEnd"/>
+      <w:r>
+        <w:rPr>
+          <w:rFonts w:ascii="Bookman Old Style" w:hAnsi="Bookman Old Style" w:cs="Arial"/>
+          <w:sz w:val="24"/>
+          <w:szCs w:val="24"/>
+          <w:lang w:val="en-US"/>
+        </w:rPr>
+        <w:t xml:space="preserve">, </w:t>
+      </w:r>
+      <w:proofErr w:type="spellStart"/>
+      <w:r>
+        <w:rPr>
+          <w:rFonts w:ascii="Bookman Old Style" w:hAnsi="Bookman Old Style" w:cs="Arial"/>
+          <w:sz w:val="24"/>
+          <w:szCs w:val="24"/>
+          <w:lang w:val="en-US"/>
+        </w:rPr>
+        <w:t>selanjutnya</w:t>
+      </w:r>
+      <w:proofErr w:type="spellEnd"/>
+      <w:r>
+        <w:rPr>
+          <w:rFonts w:ascii="Bookman Old Style" w:hAnsi="Bookman Old Style" w:cs="Arial"/>
+          <w:sz w:val="24"/>
+          <w:szCs w:val="24"/>
+          <w:lang w:val="en-US"/>
+        </w:rPr>
+        <w:t xml:space="preserve"> </w:t>
+      </w:r>
+      <w:proofErr w:type="spellStart"/>
+      <w:r>
+        <w:rPr>
+          <w:rFonts w:ascii="Bookman Old Style" w:hAnsi="Bookman Old Style" w:cs="Arial"/>
+          <w:sz w:val="24"/>
+          <w:szCs w:val="24"/>
+          <w:lang w:val="en-US"/>
+        </w:rPr>
+        <w:t>disebut</w:t>
+      </w:r>
+      <w:proofErr w:type="spellEnd"/>
+      <w:r>
+        <w:rPr>
+          <w:rFonts w:ascii="Bookman Old Style" w:hAnsi="Bookman Old Style" w:cs="Arial"/>
+          <w:sz w:val="24"/>
+          <w:szCs w:val="24"/>
+          <w:lang w:val="en-US"/>
+        </w:rPr>
+        <w:t xml:space="preserve"> </w:t>
+      </w:r>
+      <w:proofErr w:type="spellStart"/>
+      <w:r>
+        <w:rPr>
+          <w:rFonts w:ascii="Bookman Old Style" w:hAnsi="Bookman Old Style" w:cs="Arial"/>
+          <w:sz w:val="24"/>
+          <w:szCs w:val="24"/>
+          <w:lang w:val="en-US"/>
+        </w:rPr>
+        <w:t>sebagai</w:t>
+      </w:r>
+      <w:proofErr w:type="spellEnd"/>
+      <w:r>
+        <w:rPr>
+          <w:rFonts w:ascii="Bookman Old Style" w:hAnsi="Bookman Old Style" w:cs="Arial"/>
+          <w:sz w:val="24"/>
+          <w:szCs w:val="24"/>
+          <w:lang w:val="en-US"/>
+        </w:rPr>
+        <w:t xml:space="preserve"> PIHAK PERTAMA.</w:t>
+      </w:r>
+    </w:p>
+    <w:p>
+      <w:pPr>
+        <w:pStyle w:val="ListParagraph"/>
+        <w:numPr>
+          <w:ilvl w:val="0"/>
+          <w:numId w:val="2"/>
+        </w:numPr>
+        <w:spacing w:after="0" w:line="240" w:lineRule="auto"/>
+        <w:ind w:left="709"/>
+        <w:contextualSpacing w:val="0"/>
+        <w:jc w:val="both"/>
+        <w:rPr>
+          <w:rFonts w:ascii="Bookman Old Style" w:hAnsi="Bookman Old Style" w:cs="Times New Roman"/>
+          <w:sz w:val="24"/>
+          <w:szCs w:val="24"/>
+        </w:rPr>
+      </w:pPr>
+      <w:r>
+        <w:rPr>
+          <w:rFonts w:ascii="Bookman Old Style" w:hAnsi="Bookman Old Style" w:cs="Arial"/>
+          <w:sz w:val="24"/>
+          <w:szCs w:val="24"/>
+        </w:rPr>
+        <w:t xml:space="preserve">Nama </w:t>
+      </w:r>
+      <w:r>
+        <w:rPr>
+          <w:rFonts w:ascii="Bookman Old Style" w:hAnsi="Bookman Old Style" w:cs="Arial"/>
+          <w:sz w:val="24"/>
+          <w:szCs w:val="24"/>
+        </w:rPr>
+        <w:tab/>
+      </w:r>
+      <w:r>
+        <w:rPr>
+          <w:rFonts w:ascii="Bookman Old Style" w:hAnsi="Bookman Old Style" w:cs="Arial"/>
+          <w:sz w:val="24"/>
+          <w:szCs w:val="24"/>
+        </w:rPr>
+        <w:tab/>
+      </w:r>
+      <w:r>
+        <w:rPr>
+          <w:rFonts w:ascii="Bookman Old Style" w:hAnsi="Bookman Old Style" w:cs="Arial"/>
+          <w:sz w:val="24"/>
+          <w:szCs w:val="24"/>
+        </w:rPr>
+        <w:tab/>
+        <w:t xml:space="preserve">: </w:t>
+      </w:r>
+      <w:r>
+        <w:rPr>
+          <w:rFonts w:ascii="Bookman Old Style" w:hAnsi="Bookman Old Style" w:cs="Times New Roman"/>
+          <w:sz w:val="24"/>
+          <w:szCs w:val="24"/>
+          <w:lang w:val="en-US"/>
+        </w:rPr>
+        <w:t>&lt;&lt;</w:t>
+      </w:r>
+      <w:r>
+        <w:rPr>
+          <w:rFonts w:ascii="Bookman Old Style" w:hAnsi="Bookman Old Style" w:cs="Times New Roman"/>
+          <w:sz w:val="24"/>
+          <w:szCs w:val="24"/>
+          <w:lang w:val="en-US"/>
+        </w:rPr>
+        <w:t>NAMA_</w:t>
+      </w:r>
+      <w:r>
+        <w:rPr>
+          <w:rFonts w:ascii="Bookman Old Style" w:hAnsi="Bookman Old Style" w:cs="Times New Roman"/>
+          <w:sz w:val="24"/>
+          <w:szCs w:val="24"/>
+          <w:lang w:val="en-US"/>
+        </w:rPr>
+        <w:t>KETUA_TIM&gt;&gt;</w:t>
+      </w:r>
+    </w:p>
+    <w:p>
+      <w:pPr>
+        <w:pStyle w:val="ListParagraph"/>
+        <w:spacing w:after="0" w:line="240" w:lineRule="auto"/>
+        <w:contextualSpacing w:val="0"/>
+        <w:jc w:val="both"/>
+        <w:rPr>
+          <w:rFonts w:ascii="Bookman Old Style" w:hAnsi="Bookman Old Style" w:cs="Times New Roman"/>
+          <w:sz w:val="24"/>
+          <w:szCs w:val="24"/>
+          <w:lang w:val="en-US"/>
+        </w:rPr>
+      </w:pPr>
+      <w:r>
+        <w:rPr>
+          <w:rFonts w:ascii="Bookman Old Style" w:hAnsi="Bookman Old Style" w:cs="Times New Roman"/>
+          <w:sz w:val="24"/>
+          <w:szCs w:val="24"/>
+        </w:rPr>
+        <w:t>NIP</w:t>
+      </w:r>
+      <w:r>
+        <w:rPr>
+          <w:rFonts w:ascii="Bookman Old Style" w:hAnsi="Bookman Old Style" w:cs="Times New Roman"/>
+          <w:sz w:val="24"/>
+          <w:szCs w:val="24"/>
+        </w:rPr>
+        <w:tab/>
+      </w:r>
+      <w:r>
+        <w:rPr>
+          <w:rFonts w:ascii="Bookman Old Style" w:hAnsi="Bookman Old Style" w:cs="Times New Roman"/>
+          <w:sz w:val="24"/>
+          <w:szCs w:val="24"/>
+        </w:rPr>
+        <w:tab/>
+      </w:r>
+      <w:r>
+        <w:rPr>
+          <w:rFonts w:ascii="Bookman Old Style" w:hAnsi="Bookman Old Style" w:cs="Times New Roman"/>
+          <w:sz w:val="24"/>
+          <w:szCs w:val="24"/>
+        </w:rPr>
+        <w:tab/>
+      </w:r>
+      <w:r>
+        <w:rPr>
+          <w:rFonts w:ascii="Bookman Old Style" w:hAnsi="Bookman Old Style" w:cs="Times New Roman"/>
+          <w:sz w:val="24"/>
+          <w:szCs w:val="24"/>
+        </w:rPr>
+        <w:tab/>
+        <w:t xml:space="preserve">: </w:t>
+      </w:r>
+      <w:r>
+        <w:rPr>
+          <w:rFonts w:ascii="Bookman Old Style" w:hAnsi="Bookman Old Style" w:cs="Times New Roman"/>
+          <w:sz w:val="24"/>
+          <w:szCs w:val="24"/>
+          <w:lang w:val="en-US"/>
+        </w:rPr>
+        <w:t>&lt;&lt;NIP_KETUA_TIM&gt;&gt;</w:t>
+      </w:r>
+    </w:p>
+    <w:p>
+      <w:pPr>
+        <w:pStyle w:val="ListParagraph"/>
+        <w:spacing w:after="0" w:line="240" w:lineRule="auto"/>
+        <w:contextualSpacing w:val="0"/>
+        <w:jc w:val="both"/>
+        <w:rPr>
+          <w:rFonts w:ascii="Bookman Old Style" w:hAnsi="Bookman Old Style" w:cs="Times New Roman"/>
+          <w:sz w:val="24"/>
+          <w:szCs w:val="24"/>
+        </w:rPr>
+      </w:pPr>
+      <w:r>
+        <w:rPr>
+          <w:rFonts w:ascii="Bookman Old Style" w:hAnsi="Bookman Old Style" w:cs="Times New Roman"/>
+          <w:sz w:val="24"/>
+          <w:szCs w:val="24"/>
+        </w:rPr>
+        <w:t>Golongan/Pangkat</w:t>
+      </w:r>
+      <w:r>
+        <w:rPr>
+          <w:rFonts w:ascii="Bookman Old Style" w:hAnsi="Bookman Old Style" w:cs="Times New Roman"/>
+          <w:sz w:val="24"/>
+          <w:szCs w:val="24"/>
+        </w:rPr>
+        <w:tab/>
+        <w:t xml:space="preserve">: </w:t>
+      </w:r>
+      <w:r>
+        <w:rPr>
+          <w:rFonts w:ascii="Bookman Old Style" w:hAnsi="Bookman Old Style" w:cs="Times New Roman"/>
+          <w:sz w:val="24"/>
+          <w:szCs w:val="24"/>
+        </w:rPr>
+        <w:t>&lt;&lt;GOLONGAN/PANGKAT_KETUA_TIM&gt;&gt;</w:t>
+      </w:r>
+    </w:p>
+    <w:p>
+      <w:pPr>
+        <w:pStyle w:val="ListParagraph"/>
+        <w:spacing w:after="0" w:line="240" w:lineRule="auto"/>
+        <w:contextualSpacing w:val="0"/>
+        <w:jc w:val="both"/>
+        <w:rPr>
+          <w:rFonts w:ascii="Bookman Old Style" w:hAnsi="Bookman Old Style" w:cs="Times New Roman"/>
+          <w:sz w:val="24"/>
+          <w:szCs w:val="24"/>
+          <w:lang w:val="en-US"/>
+        </w:rPr>
+      </w:pPr>
+      <w:r>
+        <w:rPr>
+          <w:rFonts w:ascii="Bookman Old Style" w:hAnsi="Bookman Old Style" w:cs="Times New Roman"/>
+          <w:sz w:val="24"/>
+          <w:szCs w:val="24"/>
+        </w:rPr>
+        <w:t xml:space="preserve">Jabatan </w:t>
+      </w:r>
+      <w:r>
+        <w:rPr>
+          <w:rFonts w:ascii="Bookman Old Style" w:hAnsi="Bookman Old Style" w:cs="Times New Roman"/>
+          <w:sz w:val="24"/>
+          <w:szCs w:val="24"/>
+        </w:rPr>
+        <w:tab/>
+      </w:r>
+      <w:r>
+        <w:rPr>
+          <w:rFonts w:ascii="Bookman Old Style" w:hAnsi="Bookman Old Style" w:cs="Times New Roman"/>
+          <w:sz w:val="24"/>
+          <w:szCs w:val="24"/>
+        </w:rPr>
+        <w:tab/>
+      </w:r>
+      <w:r>
+        <w:rPr>
+          <w:rFonts w:ascii="Bookman Old Style" w:hAnsi="Bookman Old Style" w:cs="Times New Roman"/>
+          <w:sz w:val="24"/>
+          <w:szCs w:val="24"/>
+        </w:rPr>
+        <w:tab/>
+        <w:t xml:space="preserve">: </w:t>
+      </w:r>
+      <w:r>
+        <w:rPr>
+          <w:rFonts w:ascii="Bookman Old Style" w:hAnsi="Bookman Old Style" w:cs="Times New Roman"/>
+          <w:sz w:val="24"/>
+          <w:szCs w:val="24"/>
+          <w:lang w:val="en-US"/>
+        </w:rPr>
+        <w:t>&lt;&lt;JABATAN_KETUA_TIM&gt;&gt;</w:t>
+      </w:r>
+    </w:p>
+    <w:p>
+      <w:pPr>
+        <w:pStyle w:val="ListParagraph"/>
+        <w:spacing w:after="0" w:line="240" w:lineRule="auto"/>
+        <w:contextualSpacing w:val="0"/>
+        <w:jc w:val="both"/>
+        <w:rPr>
+          <w:rFonts w:ascii="Bookman Old Style" w:hAnsi="Bookman Old Style" w:cs="Arial"/>
+          <w:sz w:val="24"/>
+          <w:szCs w:val="24"/>
+          <w:lang w:val="en-US"/>
+        </w:rPr>
+      </w:pPr>
+      <w:r>
+        <w:rPr>
+          <w:rFonts w:ascii="Bookman Old Style" w:hAnsi="Bookman Old Style" w:cs="Arial"/>
+          <w:sz w:val="24"/>
+          <w:szCs w:val="24"/>
+          <w:lang w:val="en-US"/>
+        </w:rPr>
+        <w:t xml:space="preserve">Unit </w:t>
+      </w:r>
+      <w:proofErr w:type="spellStart"/>
+      <w:r>
+        <w:rPr>
+          <w:rFonts w:ascii="Bookman Old Style" w:hAnsi="Bookman Old Style" w:cs="Arial"/>
+          <w:sz w:val="24"/>
+          <w:szCs w:val="24"/>
+          <w:lang w:val="en-US"/>
+        </w:rPr>
+        <w:t>Kerja</w:t>
+      </w:r>
+      <w:proofErr w:type="spellEnd"/>
+      <w:r>
+        <w:rPr>
+          <w:rFonts w:ascii="Bookman Old Style" w:hAnsi="Bookman Old Style" w:cs="Arial"/>
+          <w:sz w:val="24"/>
+          <w:szCs w:val="24"/>
+          <w:lang w:val="en-US"/>
+        </w:rPr>
+        <w:tab/>
+      </w:r>
+      <w:r>
+        <w:rPr>
+          <w:rFonts w:ascii="Bookman Old Style" w:hAnsi="Bookman Old Style" w:cs="Arial"/>
+          <w:sz w:val="24"/>
+          <w:szCs w:val="24"/>
+          <w:lang w:val="en-US"/>
+        </w:rPr>
+        <w:tab/>
+      </w:r>
+      <w:r>
+        <w:rPr>
+          <w:rFonts w:ascii="Bookman Old Style" w:hAnsi="Bookman Old Style" w:cs="Arial"/>
+          <w:sz w:val="24"/>
+          <w:szCs w:val="24"/>
+          <w:lang w:val="en-US"/>
+        </w:rPr>
+        <w:tab/>
+        <w:t xml:space="preserve">: BPS Kota </w:t>
+      </w:r>
+      <w:proofErr w:type="spellStart"/>
+      <w:r>
+        <w:rPr>
+          <w:rFonts w:ascii="Bookman Old Style" w:hAnsi="Bookman Old Style" w:cs="Arial"/>
+          <w:sz w:val="24"/>
+          <w:szCs w:val="24"/>
+          <w:lang w:val="en-US"/>
+        </w:rPr>
+        <w:t>Subulussalam</w:t>
+      </w:r>
+      <w:proofErr w:type="spellEnd"/>
+    </w:p>
+    <w:p>
+      <w:pPr>
+        <w:pStyle w:val="ListParagraph"/>
+        <w:spacing w:after="0" w:line="240" w:lineRule="auto"/>
+        <w:contextualSpacing w:val="0"/>
+        <w:jc w:val="both"/>
+        <w:rPr>
+          <w:rFonts w:ascii="Bookman Old Style" w:hAnsi="Bookman Old Style" w:cs="Arial"/>
+          <w:sz w:val="24"/>
+          <w:szCs w:val="24"/>
+          <w:lang w:val="en-US"/>
+        </w:rPr>
+      </w:pPr>
+    </w:p>
+    <w:p>
+      <w:pPr>
+        <w:spacing w:after="0" w:line="240" w:lineRule="auto"/>
+        <w:ind w:left="709"/>
+        <w:jc w:val="both"/>
+        <w:rPr>
+          <w:rFonts w:ascii="Bookman Old Style" w:hAnsi="Bookman Old Style" w:cs="Arial"/>
+          <w:sz w:val="24"/>
+          <w:szCs w:val="24"/>
+          <w:lang w:val="en-US"/>
+        </w:rPr>
+      </w:pPr>
+      <w:proofErr w:type="spellStart"/>
+      <w:r>
+        <w:rPr>
+          <w:rFonts w:ascii="Bookman Old Style" w:hAnsi="Bookman Old Style" w:cs="Arial"/>
+          <w:sz w:val="24"/>
+          <w:szCs w:val="24"/>
+          <w:lang w:val="en-US"/>
+        </w:rPr>
+        <w:t>bertindak</w:t>
+      </w:r>
+      <w:proofErr w:type="spellEnd"/>
+      <w:r>
+        <w:rPr>
+          <w:rFonts w:ascii="Bookman Old Style" w:hAnsi="Bookman Old Style" w:cs="Arial"/>
+          <w:sz w:val="24"/>
+          <w:szCs w:val="24"/>
+          <w:lang w:val="en-US"/>
+        </w:rPr>
+        <w:t xml:space="preserve"> </w:t>
+      </w:r>
+      <w:proofErr w:type="spellStart"/>
+      <w:r>
+        <w:rPr>
+          <w:rFonts w:ascii="Bookman Old Style" w:hAnsi="Bookman Old Style" w:cs="Arial"/>
+          <w:sz w:val="24"/>
+          <w:szCs w:val="24"/>
+          <w:lang w:val="en-US"/>
+        </w:rPr>
+        <w:t>untuk</w:t>
+      </w:r>
+      <w:proofErr w:type="spellEnd"/>
+      <w:r>
+        <w:rPr>
+          <w:rFonts w:ascii="Bookman Old Style" w:hAnsi="Bookman Old Style" w:cs="Arial"/>
+          <w:sz w:val="24"/>
+          <w:szCs w:val="24"/>
+          <w:lang w:val="en-US"/>
+        </w:rPr>
+        <w:t xml:space="preserve"> dan </w:t>
+      </w:r>
+      <w:proofErr w:type="spellStart"/>
+      <w:r>
+        <w:rPr>
+          <w:rFonts w:ascii="Bookman Old Style" w:hAnsi="Bookman Old Style" w:cs="Arial"/>
+          <w:sz w:val="24"/>
+          <w:szCs w:val="24"/>
+          <w:lang w:val="en-US"/>
+        </w:rPr>
+        <w:t>atas</w:t>
+      </w:r>
+      <w:proofErr w:type="spellEnd"/>
+      <w:r>
+        <w:rPr>
+          <w:rFonts w:ascii="Bookman Old Style" w:hAnsi="Bookman Old Style" w:cs="Arial"/>
+          <w:sz w:val="24"/>
+          <w:szCs w:val="24"/>
+          <w:lang w:val="en-US"/>
+        </w:rPr>
+        <w:t xml:space="preserve"> nama BPS Kota </w:t>
+      </w:r>
+      <w:proofErr w:type="spellStart"/>
+      <w:r>
+        <w:rPr>
+          <w:rFonts w:ascii="Bookman Old Style" w:hAnsi="Bookman Old Style" w:cs="Arial"/>
+          <w:sz w:val="24"/>
+          <w:szCs w:val="24"/>
+          <w:lang w:val="en-US"/>
+        </w:rPr>
+        <w:t>Subulussalam</w:t>
+      </w:r>
+      <w:proofErr w:type="spellEnd"/>
+      <w:r>
+        <w:rPr>
+          <w:rFonts w:ascii="Bookman Old Style" w:hAnsi="Bookman Old Style" w:cs="Arial"/>
+          <w:sz w:val="24"/>
+          <w:szCs w:val="24"/>
+          <w:lang w:val="en-US"/>
+        </w:rPr>
+        <w:t xml:space="preserve">, </w:t>
+      </w:r>
+      <w:proofErr w:type="spellStart"/>
+      <w:r>
+        <w:rPr>
+          <w:rFonts w:ascii="Bookman Old Style" w:hAnsi="Bookman Old Style" w:cs="Arial"/>
+          <w:sz w:val="24"/>
+          <w:szCs w:val="24"/>
+          <w:lang w:val="en-US"/>
+        </w:rPr>
+        <w:t>selanjutnya</w:t>
+      </w:r>
+      <w:proofErr w:type="spellEnd"/>
+      <w:r>
+        <w:rPr>
+          <w:rFonts w:ascii="Bookman Old Style" w:hAnsi="Bookman Old Style" w:cs="Arial"/>
+          <w:sz w:val="24"/>
+          <w:szCs w:val="24"/>
+          <w:lang w:val="en-US"/>
+        </w:rPr>
+        <w:t xml:space="preserve"> </w:t>
+      </w:r>
+      <w:proofErr w:type="spellStart"/>
+      <w:r>
+        <w:rPr>
+          <w:rFonts w:ascii="Bookman Old Style" w:hAnsi="Bookman Old Style" w:cs="Arial"/>
+          <w:sz w:val="24"/>
+          <w:szCs w:val="24"/>
+          <w:lang w:val="en-US"/>
+        </w:rPr>
+        <w:t>disebut</w:t>
+      </w:r>
+      <w:proofErr w:type="spellEnd"/>
+      <w:r>
+        <w:rPr>
+          <w:rFonts w:ascii="Bookman Old Style" w:hAnsi="Bookman Old Style" w:cs="Arial"/>
+          <w:sz w:val="24"/>
+          <w:szCs w:val="24"/>
+          <w:lang w:val="en-US"/>
+        </w:rPr>
+        <w:t xml:space="preserve"> </w:t>
+      </w:r>
+      <w:proofErr w:type="spellStart"/>
+      <w:r>
+        <w:rPr>
+          <w:rFonts w:ascii="Bookman Old Style" w:hAnsi="Bookman Old Style" w:cs="Arial"/>
+          <w:sz w:val="24"/>
+          <w:szCs w:val="24"/>
+          <w:lang w:val="en-US"/>
+        </w:rPr>
+        <w:t>sebagai</w:t>
+      </w:r>
+      <w:proofErr w:type="spellEnd"/>
+      <w:r>
+        <w:rPr>
+          <w:rFonts w:ascii="Bookman Old Style" w:hAnsi="Bookman Old Style" w:cs="Arial"/>
+          <w:sz w:val="24"/>
+          <w:szCs w:val="24"/>
+          <w:lang w:val="en-US"/>
+        </w:rPr>
+        <w:t xml:space="preserve"> PIHAK KEDUA.</w:t>
+      </w:r>
+    </w:p>
+    <w:p>
+      <w:pPr>
+        <w:spacing w:after="0" w:line="240" w:lineRule="auto"/>
+        <w:jc w:val="both"/>
+        <w:rPr>
+          <w:rFonts w:ascii="Bookman Old Style" w:hAnsi="Bookman Old Style" w:cs="Arial"/>
+          <w:sz w:val="24"/>
+          <w:szCs w:val="24"/>
+        </w:rPr>
+      </w:pPr>
+    </w:p>
+    <w:p>
+      <w:pPr>
+        <w:spacing w:after="120" w:line="240" w:lineRule="auto"/>
+        <w:ind w:left="360"/>
+        <w:jc w:val="both"/>
+        <w:rPr>
+          <w:rFonts w:ascii="Bookman Old Style" w:hAnsi="Bookman Old Style" w:cs="Arial"/>
+          <w:sz w:val="24"/>
+          <w:szCs w:val="24"/>
+        </w:rPr>
+      </w:pPr>
+      <w:r>
+        <w:rPr>
+          <w:rFonts w:ascii="Bookman Old Style" w:hAnsi="Bookman Old Style" w:cs="Arial"/>
+          <w:sz w:val="24"/>
+          <w:szCs w:val="24"/>
+        </w:rPr>
+        <w:t xml:space="preserve">Berdasarkan Surat Keputusan Kepala BPS Kota Subulussalam </w:t>
+      </w:r>
+      <w:proofErr w:type="spellStart"/>
+      <w:r>
+        <w:rPr>
+          <w:rFonts w:ascii="Bookman Old Style" w:hAnsi="Bookman Old Style" w:cs="Arial"/>
+          <w:sz w:val="24"/>
+          <w:szCs w:val="24"/>
+          <w:lang w:val="en-US"/>
+        </w:rPr>
+        <w:t>Nomor</w:t>
+      </w:r>
+      <w:proofErr w:type="spellEnd"/>
+      <w:r>
+        <w:rPr>
+          <w:rFonts w:ascii="Bookman Old Style" w:hAnsi="Bookman Old Style" w:cs="Arial"/>
+          <w:sz w:val="24"/>
+          <w:szCs w:val="24"/>
+          <w:lang w:val="en-US"/>
+        </w:rPr>
+        <w:t xml:space="preserve"> </w:t>
+      </w:r>
+      <w:r>
+        <w:rPr>
+          <w:rFonts w:ascii="Bookman Old Style" w:hAnsi="Bookman Old Style" w:cs="Arial"/>
+          <w:sz w:val="24"/>
+          <w:szCs w:val="24"/>
+          <w:lang w:val="en-US"/>
+        </w:rPr>
+        <w:t>&lt;&lt;NOMOR_KEPKA&gt;&gt;</w:t>
+      </w:r>
+      <w:r>
+        <w:rPr>
+          <w:rFonts w:ascii="Bookman Old Style" w:hAnsi="Bookman Old Style" w:cs="Arial"/>
+          <w:sz w:val="24"/>
+          <w:szCs w:val="24"/>
+          <w:lang w:val="en-US"/>
+        </w:rPr>
+        <w:t xml:space="preserve"> </w:t>
+      </w:r>
+      <w:r>
+        <w:rPr>
+          <w:rFonts w:ascii="Bookman Old Style" w:hAnsi="Bookman Old Style" w:cs="Arial"/>
+          <w:sz w:val="24"/>
+          <w:szCs w:val="24"/>
+        </w:rPr>
+        <w:t xml:space="preserve">tanggal </w:t>
+      </w:r>
+      <w:r>
+        <w:rPr>
+          <w:rFonts w:ascii="Bookman Old Style" w:hAnsi="Bookman Old Style" w:cs="Arial"/>
+          <w:sz w:val="24"/>
+          <w:szCs w:val="24"/>
+          <w:lang w:val="en-US"/>
+        </w:rPr>
+        <w:t>&lt;&lt;TANGGAL_KEPKA&gt;&gt;</w:t>
+      </w:r>
+      <w:r>
+        <w:rPr>
+          <w:rFonts w:ascii="Bookman Old Style" w:hAnsi="Bookman Old Style" w:cs="Arial"/>
+          <w:sz w:val="24"/>
+          <w:szCs w:val="24"/>
+        </w:rPr>
+        <w:t xml:space="preserve">, bersama ini PIHAK PERTAMA telah menyerahkan pekerjaan </w:t>
+      </w:r>
+      <w:proofErr w:type="spellStart"/>
+      <w:r>
+        <w:rPr>
+          <w:rFonts w:ascii="Bookman Old Style" w:hAnsi="Bookman Old Style" w:cs="Arial"/>
+          <w:sz w:val="24"/>
+          <w:szCs w:val="24"/>
+          <w:lang w:val="en-US"/>
+        </w:rPr>
+        <w:t>hasil</w:t>
+      </w:r>
+      <w:proofErr w:type="spellEnd"/>
+      <w:r>
+        <w:rPr>
+          <w:rFonts w:ascii="Bookman Old Style" w:hAnsi="Bookman Old Style" w:cs="Arial"/>
+          <w:sz w:val="24"/>
+          <w:szCs w:val="24"/>
+          <w:lang w:val="en-US"/>
+        </w:rPr>
+        <w:t xml:space="preserve"> </w:t>
+      </w:r>
+      <w:r>
+        <w:rPr>
+          <w:rFonts w:ascii="Bookman Old Style" w:hAnsi="Bookman Old Style" w:cs="Arial"/>
+          <w:noProof/>
+          <w:sz w:val="24"/>
+          <w:szCs w:val="24"/>
+        </w:rPr>
+        <w:t>&lt;&lt;URAIAN_PEKERJAAN&gt;&gt;</w:t>
+      </w:r>
+      <w:r>
+        <w:rPr>
+          <w:rFonts w:ascii="Bookman Old Style" w:hAnsi="Bookman Old Style" w:cs="Arial"/>
+          <w:sz w:val="24"/>
+          <w:szCs w:val="24"/>
+        </w:rPr>
+        <w:t xml:space="preserve">  </w:t>
+      </w:r>
+      <w:r>
+        <w:rPr>
+          <w:rFonts w:ascii="Bookman Old Style" w:hAnsi="Bookman Old Style" w:cs="Arial"/>
+          <w:sz w:val="24"/>
+          <w:szCs w:val="24"/>
+        </w:rPr>
+        <w:t>kepada PIHAK KEDUA, dengan ketentuan sebagai berikut:</w:t>
+      </w:r>
+    </w:p>
+    <w:p>
+      <w:pPr>
+        <w:pStyle w:val="ListParagraph"/>
+        <w:numPr>
+          <w:ilvl w:val="0"/>
+          <w:numId w:val="1"/>
+        </w:numPr>
+        <w:spacing w:after="120" w:line="240" w:lineRule="auto"/>
+        <w:jc w:val="both"/>
+        <w:rPr>
+          <w:rFonts w:ascii="Bookman Old Style" w:hAnsi="Bookman Old Style" w:cs="Arial"/>
+          <w:sz w:val="24"/>
+          <w:szCs w:val="24"/>
+        </w:rPr>
+      </w:pPr>
+      <w:r>
+        <w:rPr>
+          <w:rFonts w:ascii="Bookman Old Style" w:hAnsi="Bookman Old Style" w:cs="Arial"/>
+          <w:sz w:val="24"/>
+          <w:szCs w:val="24"/>
+        </w:rPr>
+        <w:t xml:space="preserve">PIHAK PERTAMA telah melaksanakan pekerjaan </w:t>
+      </w:r>
+      <w:r>
+        <w:rPr>
+          <w:rFonts w:ascii="Bookman Old Style" w:hAnsi="Bookman Old Style" w:cs="Arial"/>
+          <w:noProof/>
+          <w:sz w:val="24"/>
+          <w:szCs w:val="24"/>
+        </w:rPr>
+        <w:t>&lt;&lt;URAIAN_PEKERJAAN&gt;&gt;</w:t>
+      </w:r>
+      <w:r>
+        <w:rPr>
+          <w:rFonts w:ascii="Bookman Old Style" w:hAnsi="Bookman Old Style" w:cs="Arial"/>
+          <w:sz w:val="24"/>
+          <w:szCs w:val="24"/>
+        </w:rPr>
+        <w:t xml:space="preserve">  </w:t>
+      </w:r>
+      <w:r>
+        <w:rPr>
+          <w:rFonts w:ascii="Bookman Old Style" w:hAnsi="Bookman Old Style" w:cs="Arial"/>
+          <w:sz w:val="24"/>
+          <w:szCs w:val="24"/>
+        </w:rPr>
+        <w:t xml:space="preserve">berdasarkan Perjanjian Kerja </w:t>
+      </w:r>
+      <w:r>
+        <w:rPr>
+          <w:rFonts w:ascii="Bookman Old Style" w:hAnsi="Bookman Old Style" w:cs="Arial"/>
+          <w:sz w:val="24"/>
+          <w:szCs w:val="24"/>
+        </w:rPr>
+        <w:fldChar w:fldCharType="begin"/>
+      </w:r>
+      <w:r>
+        <w:rPr>
+          <w:rFonts w:ascii="Bookman Old Style" w:hAnsi="Bookman Old Style" w:cs="Arial"/>
+          <w:sz w:val="24"/>
+          <w:szCs w:val="24"/>
+        </w:rPr>
+        <w:instrText xml:space="preserve"> MERGEFIELD "no_SPK" </w:instrText>
+      </w:r>
+      <w:r>
+        <w:rPr>
+          <w:rFonts w:ascii="Bookman Old Style" w:hAnsi="Bookman Old Style" w:cs="Arial"/>
+          <w:sz w:val="24"/>
+          <w:szCs w:val="24"/>
+        </w:rPr>
+        <w:fldChar w:fldCharType="separate"/>
+      </w:r>
+      <w:r>
+        <w:rPr>
+          <w:rFonts w:ascii="Bookman Old Style" w:hAnsi="Bookman Old Style" w:cs="Arial"/>
+          <w:noProof/>
+          <w:sz w:val="24"/>
+          <w:szCs w:val="24"/>
+        </w:rPr>
+        <w:t xml:space="preserve">Nomor </w:t>
+      </w:r>
+      <w:r>
+        <w:rPr>
+          <w:rFonts w:ascii="Bookman Old Style" w:hAnsi="Bookman Old Style" w:cs="Arial"/>
+          <w:noProof/>
+          <w:sz w:val="24"/>
+          <w:szCs w:val="24"/>
+        </w:rPr>
+        <w:t>&lt;&lt;NO_SPK&gt;&gt;</w:t>
+      </w:r>
+      <w:r>
+        <w:rPr>
+          <w:rFonts w:ascii="Bookman Old Style" w:hAnsi="Bookman Old Style" w:cs="Arial"/>
+          <w:sz w:val="24"/>
+          <w:szCs w:val="24"/>
+        </w:rPr>
+        <w:fldChar w:fldCharType="end"/>
+      </w:r>
+      <w:r>
+        <w:rPr>
+          <w:rFonts w:ascii="Bookman Old Style" w:hAnsi="Bookman Old Style" w:cs="Arial"/>
+          <w:sz w:val="24"/>
+          <w:szCs w:val="24"/>
+        </w:rPr>
+        <w:t>,  tanggal</w:t>
+      </w:r>
+      <w:r>
+        <w:rPr>
+          <w:rFonts w:ascii="Bookman Old Style" w:hAnsi="Bookman Old Style" w:cs="Arial"/>
+          <w:sz w:val="24"/>
+          <w:szCs w:val="24"/>
+          <w:lang w:val="en-US"/>
+        </w:rPr>
+        <w:t xml:space="preserve"> </w:t>
+      </w:r>
+      <w:r>
+        <w:rPr>
+          <w:rFonts w:ascii="Bookman Old Style" w:hAnsi="Bookman Old Style" w:cs="Arial"/>
+          <w:noProof/>
+          <w:sz w:val="24"/>
+          <w:szCs w:val="24"/>
+          <w:lang w:val="en-US"/>
+        </w:rPr>
+        <w:t>&lt;&lt;TANGGAL&gt;&gt;</w:t>
+      </w:r>
+      <w:r>
+        <w:rPr>
+          <w:rFonts w:ascii="Bookman Old Style" w:hAnsi="Bookman Old Style" w:cs="Arial"/>
+          <w:sz w:val="24"/>
+          <w:szCs w:val="24"/>
+        </w:rPr>
+        <w:t>, bulan</w:t>
+      </w:r>
+      <w:r>
+        <w:rPr>
+          <w:rFonts w:ascii="Bookman Old Style" w:hAnsi="Bookman Old Style" w:cs="Arial"/>
+          <w:sz w:val="24"/>
+          <w:szCs w:val="24"/>
+          <w:lang w:val="en-US"/>
+        </w:rPr>
+        <w:t xml:space="preserve"> </w:t>
+      </w:r>
+      <w:r>
+        <w:rPr>
+          <w:rFonts w:ascii="Bookman Old Style" w:hAnsi="Bookman Old Style" w:cs="Arial"/>
+          <w:sz w:val="24"/>
+          <w:szCs w:val="24"/>
+          <w:lang w:val="en-US"/>
+        </w:rPr>
+        <w:t>&lt;&lt;BULAN&gt;&gt;</w:t>
+      </w:r>
+      <w:r>
+        <w:rPr>
+          <w:rFonts w:ascii="Bookman Old Style" w:hAnsi="Bookman Old Style" w:cs="Arial"/>
+          <w:sz w:val="24"/>
+          <w:szCs w:val="24"/>
+        </w:rPr>
+        <w:t xml:space="preserve">, </w:t>
+      </w:r>
+      <w:r>
+        <w:rPr>
+          <w:rFonts w:ascii="Bookman Old Style" w:hAnsi="Bookman Old Style" w:cs="Arial"/>
+          <w:sz w:val="24"/>
+          <w:szCs w:val="24"/>
+        </w:rPr>
+        <w:t>&lt;&lt;TAHUN&gt;&gt;</w:t>
+      </w:r>
+      <w:r>
+        <w:rPr>
+          <w:rFonts w:ascii="Bookman Old Style" w:hAnsi="Bookman Old Style" w:cs="Arial"/>
+          <w:sz w:val="24"/>
+          <w:szCs w:val="24"/>
+        </w:rPr>
+        <w:t>;</w:t>
+      </w:r>
+    </w:p>
+    <w:p>
+      <w:pPr>
+        <w:pStyle w:val="ListParagraph"/>
+        <w:numPr>
+          <w:ilvl w:val="0"/>
+          <w:numId w:val="1"/>
+        </w:numPr>
+        <w:spacing w:after="120" w:line="240" w:lineRule="auto"/>
+        <w:jc w:val="both"/>
+        <w:rPr>
+          <w:rFonts w:ascii="Bookman Old Style" w:hAnsi="Bookman Old Style" w:cs="Arial"/>
+          <w:sz w:val="24"/>
+          <w:szCs w:val="24"/>
+        </w:rPr>
+      </w:pPr>
+      <w:r>
+        <w:rPr>
+          <w:rFonts w:ascii="Bookman Old Style" w:hAnsi="Bookman Old Style" w:cs="Arial"/>
+          <w:sz w:val="24"/>
+          <w:szCs w:val="24"/>
+        </w:rPr>
+        <w:t xml:space="preserve">Berdasarkan angka 1 tersebut di atas, PIHAK PERTAMA menyerahkan hasil pekerjaan </w:t>
+      </w:r>
+      <w:r>
+        <w:rPr>
+          <w:rFonts w:ascii="Bookman Old Style" w:hAnsi="Bookman Old Style" w:cs="Arial"/>
+          <w:noProof/>
+          <w:sz w:val="24"/>
+          <w:szCs w:val="24"/>
+        </w:rPr>
+        <w:t>&lt;&lt;URAIAN_PEKERJAAN&gt;&gt;</w:t>
+      </w:r>
+      <w:r>
+        <w:rPr>
+          <w:rFonts w:ascii="Bookman Old Style" w:hAnsi="Bookman Old Style" w:cs="Arial"/>
+          <w:sz w:val="24"/>
+          <w:szCs w:val="24"/>
+        </w:rPr>
+        <w:t xml:space="preserve"> </w:t>
+      </w:r>
+      <w:r>
+        <w:rPr>
+          <w:rFonts w:ascii="Bookman Old Style" w:hAnsi="Bookman Old Style" w:cs="Arial"/>
+          <w:sz w:val="24"/>
+          <w:szCs w:val="24"/>
+        </w:rPr>
+        <w:t>kepada PIHAK KEDUA, dan PIHAK KEDUA menerima hasil pekerjaan tersebut yang telah sesuai dengan seharusnya;</w:t>
+      </w:r>
+    </w:p>
+    <w:p>
+      <w:pPr>
+        <w:pStyle w:val="ListParagraph"/>
+        <w:numPr>
+          <w:ilvl w:val="0"/>
+          <w:numId w:val="1"/>
+        </w:numPr>
+        <w:spacing w:after="120" w:line="240" w:lineRule="auto"/>
+        <w:jc w:val="both"/>
+        <w:rPr>
+          <w:rFonts w:ascii="Bookman Old Style" w:hAnsi="Bookman Old Style" w:cs="Arial"/>
+          <w:sz w:val="24"/>
+          <w:szCs w:val="24"/>
+        </w:rPr>
+      </w:pPr>
+      <w:r>
+        <w:rPr>
+          <w:rFonts w:ascii="Bookman Old Style" w:hAnsi="Bookman Old Style" w:cs="Arial"/>
+          <w:sz w:val="24"/>
+          <w:szCs w:val="24"/>
+        </w:rPr>
+        <w:t xml:space="preserve">Hasil pekerjaan PIHAK </w:t>
+      </w:r>
+      <w:r>
+        <w:rPr>
+          <w:rFonts w:ascii="Bookman Old Style" w:hAnsi="Bookman Old Style" w:cs="Arial"/>
+          <w:sz w:val="24"/>
+          <w:szCs w:val="24"/>
+          <w:lang w:val="en-US"/>
+        </w:rPr>
+        <w:t>PERTAMA</w:t>
+      </w:r>
+      <w:r>
+        <w:rPr>
+          <w:rFonts w:ascii="Bookman Old Style" w:hAnsi="Bookman Old Style" w:cs="Arial"/>
+          <w:sz w:val="24"/>
+          <w:szCs w:val="24"/>
+        </w:rPr>
+        <w:t xml:space="preserve"> telah sesuai dengan jumlah dan spesifikasi teknis/kualitas yang ditetapkan dalam </w:t>
+      </w:r>
+      <w:r>
+        <w:rPr>
+          <w:rFonts w:ascii="Bookman Old Style" w:hAnsi="Bookman Old Style" w:cs="Arial"/>
+          <w:sz w:val="24"/>
+          <w:szCs w:val="24"/>
+          <w:lang w:val="en-US"/>
+        </w:rPr>
+        <w:t>SK</w:t>
+      </w:r>
+      <w:r>
+        <w:rPr>
+          <w:rFonts w:ascii="Bookman Old Style" w:hAnsi="Bookman Old Style" w:cs="Arial"/>
+          <w:sz w:val="24"/>
+          <w:szCs w:val="24"/>
+        </w:rPr>
+        <w:t>.</w:t>
+      </w:r>
+    </w:p>
+    <w:p>
+      <w:pPr>
+        <w:pStyle w:val="ListParagraph"/>
+        <w:numPr>
+          <w:ilvl w:val="0"/>
+          <w:numId w:val="1"/>
+        </w:numPr>
+        <w:spacing w:after="120" w:line="240" w:lineRule="auto"/>
+        <w:contextualSpacing w:val="0"/>
+        <w:jc w:val="both"/>
+        <w:rPr>
+          <w:rFonts w:ascii="Bookman Old Style" w:hAnsi="Bookman Old Style" w:cs="Arial"/>
+          <w:sz w:val="24"/>
+          <w:szCs w:val="24"/>
+        </w:rPr>
+      </w:pPr>
+      <w:r>
+        <w:rPr>
+          <w:rFonts w:ascii="Bookman Old Style" w:hAnsi="Bookman Old Style" w:cs="Arial"/>
+          <w:sz w:val="24"/>
+          <w:szCs w:val="24"/>
+        </w:rPr>
+        <w:t>Pelaksanaan penyerahan hasil pekerjaan tersebut di atas dilaksanakan secara langsung di BPS Kota Subulussalam, Jl. Lae Oram Kompleks Perkantoran Walikota Subulussalam.</w:t>
+      </w:r>
+    </w:p>
+    <w:p>
+      <w:pPr>
+        <w:spacing w:after="0" w:line="240" w:lineRule="auto"/>
+        <w:ind w:left="284"/>
+        <w:jc w:val="both"/>
+        <w:rPr>
+          <w:rFonts w:ascii="Bookman Old Style" w:hAnsi="Bookman Old Style" w:cs="Arial"/>
+          <w:sz w:val="24"/>
+          <w:szCs w:val="24"/>
+        </w:rPr>
+      </w:pPr>
+    </w:p>
+    <w:p>
+      <w:pPr>
+        <w:spacing w:after="0" w:line="240" w:lineRule="auto"/>
+        <w:ind w:left="284"/>
+        <w:jc w:val="both"/>
+        <w:rPr>
+          <w:rFonts w:ascii="Bookman Old Style" w:hAnsi="Bookman Old Style" w:cs="Arial"/>
+          <w:sz w:val="24"/>
+          <w:szCs w:val="24"/>
+        </w:rPr>
+      </w:pPr>
+      <w:r>
+        <w:rPr>
+          <w:rFonts w:ascii="Bookman Old Style" w:hAnsi="Bookman Old Style" w:cs="Arial"/>
+          <w:sz w:val="24"/>
+          <w:szCs w:val="24"/>
+        </w:rPr>
+        <w:t>Demikian Berita Acara ini dibuat untuk dipergunakan sebagaimana mestinya.</w:t>
+      </w:r>
+    </w:p>
+    <w:p>
+      <w:pPr>
+        <w:spacing w:after="0" w:line="240" w:lineRule="auto"/>
+        <w:jc w:val="both"/>
+        <w:rPr>
+          <w:rFonts w:ascii="Bookman Old Style" w:hAnsi="Bookman Old Style" w:cs="Arial"/>
+          <w:sz w:val="24"/>
+          <w:szCs w:val="24"/>
+        </w:rPr>
+      </w:pPr>
+    </w:p>
+    <w:p>
+      <w:pPr>
+        <w:spacing w:after="0" w:line="240" w:lineRule="auto"/>
+        <w:jc w:val="both"/>
+        <w:rPr>
+          <w:rFonts w:ascii="Bookman Old Style" w:hAnsi="Bookman Old Style" w:cs="Arial"/>
+          <w:sz w:val="24"/>
+          <w:szCs w:val="24"/>
+        </w:rPr>
+      </w:pPr>
+    </w:p>
+    <w:tbl>
+      <w:tblPr>
+        <w:tblStyle w:val="TableGrid"/>
+        <w:tblW w:w="8790" w:type="dxa"/>
+        <w:jc w:val="center"/>
+        <w:tblLook w:val="04A0" w:firstRow="1" w:lastRow="0" w:firstColumn="1" w:lastColumn="0" w:noHBand="0" w:noVBand="1"/>
+      </w:tblPr>
+      <w:tblGrid>
+        <w:gridCol w:w="4536"/>
+        <w:gridCol w:w="4254"/>
+      </w:tblGrid>
+      <w:tr>
+        <w:trPr>
+          <w:trHeight w:val="1291"/>
+          <w:jc w:val="center"/>
+        </w:trPr>
+        <w:tc>
+          <w:tcPr>
+            <w:tcW w:w="4536" w:type="dxa"/>
+            <w:tcBorders>
+              <w:top w:val="nil"/>
+              <w:left w:val="nil"/>
+              <w:bottom w:val="nil"/>
+              <w:right w:val="nil"/>
+            </w:tcBorders>
+          </w:tcPr>
+          <w:p>
+            <w:pPr>
+              <w:jc w:val="center"/>
+              <w:rPr>
+                <w:rFonts w:ascii="Bookman Old Style" w:hAnsi="Bookman Old Style" w:cs="Arial"/>
+                <w:sz w:val="24"/>
+                <w:szCs w:val="24"/>
+              </w:rPr>
+            </w:pPr>
+            <w:r>
+              <w:rPr>
+                <w:rFonts w:ascii="Bookman Old Style" w:hAnsi="Bookman Old Style" w:cs="Arial"/>
+                <w:sz w:val="24"/>
+                <w:szCs w:val="24"/>
+              </w:rPr>
+              <w:t>PIHAK KEDUA,</w:t>
+            </w:r>
+          </w:p>
+          <w:p>
+            <w:pPr>
+              <w:jc w:val="center"/>
+              <w:rPr>
+                <w:rFonts w:ascii="Bookman Old Style" w:hAnsi="Bookman Old Style" w:cs="Arial"/>
+                <w:sz w:val="24"/>
+                <w:szCs w:val="24"/>
+              </w:rPr>
+            </w:pPr>
+          </w:p>
+          <w:p>
+            <w:pPr>
+              <w:jc w:val="center"/>
+              <w:rPr>
+                <w:rFonts w:ascii="Bookman Old Style" w:hAnsi="Bookman Old Style" w:cs="Arial"/>
+                <w:sz w:val="24"/>
+                <w:szCs w:val="24"/>
+              </w:rPr>
+            </w:pPr>
+          </w:p>
+          <w:p>
+            <w:pPr>
+              <w:jc w:val="center"/>
+              <w:rPr>
+                <w:rFonts w:ascii="Bookman Old Style" w:hAnsi="Bookman Old Style" w:cs="Arial"/>
+                <w:sz w:val="24"/>
+                <w:szCs w:val="24"/>
+              </w:rPr>
+            </w:pPr>
+          </w:p>
+          <w:p>
+            <w:pPr>
+              <w:jc w:val="center"/>
+              <w:rPr>
+                <w:rFonts w:ascii="Bookman Old Style" w:hAnsi="Bookman Old Style" w:cs="Arial"/>
+                <w:sz w:val="24"/>
+                <w:szCs w:val="24"/>
+              </w:rPr>
+            </w:pPr>
+          </w:p>
+          <w:p>
+            <w:pPr>
+              <w:jc w:val="center"/>
+              <w:rPr>
+                <w:rFonts w:ascii="Bookman Old Style" w:hAnsi="Bookman Old Style" w:cs="Times New Roman"/>
+                <w:color w:val="000000" w:themeColor="text1"/>
+                <w:sz w:val="24"/>
+                <w:szCs w:val="24"/>
+                <w:u w:val="single"/>
+              </w:rPr>
+            </w:pPr>
+            <w:r>
+              <w:rPr>
+                <w:rFonts w:ascii="Bookman Old Style" w:hAnsi="Bookman Old Style" w:cs="Times New Roman"/>
+                <w:color w:val="000000" w:themeColor="text1"/>
+                <w:sz w:val="24"/>
+                <w:szCs w:val="24"/>
+                <w:u w:val="single"/>
+                <w:lang w:val="en-US"/>
+              </w:rPr>
+              <w:lastRenderedPageBreak/>
+              <w:t>&lt;&lt;NAMA_KETUA_TIM&gt;&gt;</w:t>
+            </w:r>
+          </w:p>
+          <w:p>
+            <w:pPr>
+              <w:jc w:val="center"/>
+              <w:rPr>
+                <w:rFonts w:ascii="Bookman Old Style" w:hAnsi="Bookman Old Style" w:cs="Arial"/>
+                <w:sz w:val="24"/>
+                <w:szCs w:val="24"/>
+                <w:lang w:val="en-US"/>
+              </w:rPr>
+            </w:pPr>
+            <w:r>
+              <w:rPr>
+                <w:rFonts w:ascii="Bookman Old Style" w:hAnsi="Bookman Old Style" w:cs="Times New Roman"/>
+                <w:color w:val="000000" w:themeColor="text1"/>
+                <w:sz w:val="24"/>
+                <w:szCs w:val="24"/>
+              </w:rPr>
+              <w:t xml:space="preserve">NIP. </w:t>
+            </w:r>
+            <w:r>
+              <w:rPr>
+                <w:rFonts w:ascii="Bookman Old Style" w:hAnsi="Bookman Old Style" w:cs="Times New Roman"/>
+                <w:color w:val="000000" w:themeColor="text1"/>
+                <w:sz w:val="24"/>
+                <w:szCs w:val="24"/>
+                <w:lang w:val="en-US"/>
+              </w:rPr>
+              <w:t>&lt;&lt;NIP_KETUA_TIM&gt;&gt;</w:t>
+            </w:r>
+          </w:p>
+        </w:tc>
+        <w:tc>
+          <w:tcPr>
+            <w:tcW w:w="4254" w:type="dxa"/>
+            <w:tcBorders>
+              <w:top w:val="nil"/>
+              <w:left w:val="nil"/>
+              <w:bottom w:val="nil"/>
+              <w:right w:val="nil"/>
+            </w:tcBorders>
+          </w:tcPr>
+          <w:p>
+            <w:pPr>
+              <w:jc w:val="center"/>
+              <w:rPr>
+                <w:rFonts w:ascii="Bookman Old Style" w:hAnsi="Bookman Old Style" w:cs="Arial"/>
+                <w:sz w:val="24"/>
+                <w:szCs w:val="24"/>
+              </w:rPr>
+            </w:pPr>
+            <w:r>
+              <w:rPr>
+                <w:rFonts w:ascii="Bookman Old Style" w:hAnsi="Bookman Old Style" w:cs="Arial"/>
+                <w:sz w:val="24"/>
+                <w:szCs w:val="24"/>
+              </w:rPr>
+              <w:lastRenderedPageBreak/>
+              <w:t>PIHAK PERTAMA,</w:t>
+            </w:r>
+          </w:p>
+          <w:p>
+            <w:pPr>
+              <w:jc w:val="center"/>
+              <w:rPr>
+                <w:rFonts w:ascii="Bookman Old Style" w:hAnsi="Bookman Old Style" w:cs="Arial"/>
+                <w:sz w:val="24"/>
+                <w:szCs w:val="24"/>
+              </w:rPr>
+            </w:pPr>
+          </w:p>
+          <w:p>
+            <w:pPr>
+              <w:jc w:val="center"/>
+              <w:rPr>
+                <w:rFonts w:ascii="Bookman Old Style" w:hAnsi="Bookman Old Style" w:cs="Arial"/>
+                <w:sz w:val="24"/>
+                <w:szCs w:val="24"/>
+              </w:rPr>
+            </w:pPr>
+          </w:p>
+          <w:p>
+            <w:pPr>
+              <w:jc w:val="center"/>
+              <w:rPr>
+                <w:rFonts w:ascii="Bookman Old Style" w:hAnsi="Bookman Old Style" w:cs="Arial"/>
+                <w:sz w:val="24"/>
+                <w:szCs w:val="24"/>
+              </w:rPr>
+            </w:pPr>
+          </w:p>
+          <w:p>
+            <w:pPr>
+              <w:jc w:val="center"/>
+              <w:rPr>
+                <w:rFonts w:ascii="Bookman Old Style" w:hAnsi="Bookman Old Style" w:cs="Arial"/>
+                <w:sz w:val="24"/>
+                <w:szCs w:val="24"/>
+              </w:rPr>
+            </w:pPr>
+          </w:p>
+          <w:p>
+            <w:pPr>
+              <w:jc w:val="center"/>
+              <w:rPr>
+                <w:rFonts w:ascii="Bookman Old Style" w:hAnsi="Bookman Old Style" w:cs="Arial"/>
+                <w:noProof/>
+                <w:sz w:val="24"/>
+                <w:szCs w:val="24"/>
+                <w:u w:val="single"/>
+              </w:rPr>
+            </w:pPr>
+            <w:r>
+              <w:rPr>
+                <w:rFonts w:ascii="Bookman Old Style" w:hAnsi="Bookman Old Style" w:cs="Arial"/>
+                <w:noProof/>
+                <w:sz w:val="24"/>
+                <w:szCs w:val="24"/>
+                <w:u w:val="single"/>
+              </w:rPr>
+              <w:lastRenderedPageBreak/>
+              <w:t>&lt;&lt;NAMA_PIHAK_PERTAMA&gt;&gt;</w:t>
+            </w:r>
+          </w:p>
+          <w:p>
+            <w:pPr>
+              <w:jc w:val="center"/>
+              <w:rPr>
+                <w:rFonts w:ascii="Bookman Old Style" w:hAnsi="Bookman Old Style" w:cs="Arial"/>
+                <w:sz w:val="24"/>
+                <w:szCs w:val="24"/>
+                <w:lang w:val="en-US"/>
+              </w:rPr>
+            </w:pPr>
+          </w:p>
+        </w:tc>
+      </w:tr>
+    </w:tbl>
+    <w:p>
+      <w:pPr>
+        <w:rPr>
+          <w:rFonts w:ascii="Bookman Old Style" w:hAnsi="Bookman Old Style"/>
+          <w:sz w:val="24"/>
+          <w:szCs w:val="24"/>
+        </w:rPr>
+      </w:pPr>
+    </w:p>
+    <w:sectPr>
+      <w:pgSz w:w="11906" w:h="16838"/>
+      <w:pgMar w:top="851" w:right="851" w:bottom="851" w:left="851" w:header="709" w:footer="709" w:gutter="0"/>
+      <w:cols w:space="708"/>
+      <w:docGrid w:linePitch="360"/>
+    </w:sectPr>
+  </w:body>
+</w:document>
 </file>
 
 <file path=word/numbering.xml><?xml version="1.0" encoding="utf-8"?>

</xml_diff>